<commit_message>
fix bug question image and table show
</commit_message>
<xml_diff>
--- a/src/data/documents/10. ĐỊNH LƯỢNG CA 72-4.docx
+++ b/src/data/documents/10. ĐỊNH LƯỢNG CA 72-4.docx
@@ -1,10 +1,11 @@
 
 <file path=word/document.xml><?xml version="1.0" encoding="utf-8"?>
-<w:document xmlns:wpc="http://schemas.microsoft.com/office/word/2010/wordprocessingCanvas" xmlns:cx="http://schemas.microsoft.com/office/drawing/2014/chartex" xmlns:mc="http://schemas.openxmlformats.org/markup-compatibility/2006" xmlns:o="urn:schemas-microsoft-com:office:office" xmlns:r="http://schemas.openxmlformats.org/officeDocument/2006/relationships" xmlns:m="http://schemas.openxmlformats.org/officeDocument/2006/math" xmlns:v="urn:schemas-microsoft-com:vml" xmlns:wp14="http://schemas.microsoft.com/office/word/2010/wordprocessingDrawing" xmlns:wp="http://schemas.openxmlformats.org/drawingml/2006/wordprocessingDrawing" xmlns:w10="urn:schemas-microsoft-com:office:word" xmlns:w="http://schemas.openxmlformats.org/wordprocessingml/2006/main" xmlns:w14="http://schemas.microsoft.com/office/word/2010/wordml" xmlns:w15="http://schemas.microsoft.com/office/word/2012/wordml" xmlns:w16se="http://schemas.microsoft.com/office/word/2015/wordml/symex" xmlns:wpg="http://schemas.microsoft.com/office/word/2010/wordprocessingGroup" xmlns:wpi="http://schemas.microsoft.com/office/word/2010/wordprocessingInk" xmlns:wne="http://schemas.microsoft.com/office/word/2006/wordml" xmlns:wps="http://schemas.microsoft.com/office/word/2010/wordprocessingShape" mc:Ignorable="w14 w15 w16se wp14">
+<w:document xmlns:o="urn:schemas-microsoft-com:office:office" xmlns:r="http://schemas.openxmlformats.org/officeDocument/2006/relationships" xmlns:v="urn:schemas-microsoft-com:vml" xmlns:w="http://schemas.openxmlformats.org/wordprocessingml/2006/main" xmlns:w10="urn:schemas-microsoft-com:office:word" xmlns:wp="http://schemas.openxmlformats.org/drawingml/2006/wordprocessingDrawing" xmlns:pic="http://schemas.openxmlformats.org/drawingml/2006/picture" xmlns:wps="http://schemas.microsoft.com/office/word/2010/wordprocessingShape" xmlns:wpg="http://schemas.microsoft.com/office/word/2010/wordprocessingGroup" xmlns:mc="http://schemas.openxmlformats.org/markup-compatibility/2006" xmlns:wp14="http://schemas.microsoft.com/office/word/2010/wordprocessingDrawing" xmlns:w14="http://schemas.microsoft.com/office/word/2010/wordml" xmlns:w15="http://schemas.microsoft.com/office/word/2012/wordml" mc:Ignorable="w14 wp14 w15">
   <w:body>
     <w:p>
       <w:pPr>
-        <w:spacing w:after="0" w:line="240" w:lineRule="auto"/>
+        <w:pStyle w:val="Normal"/>
+        <w:spacing w:lineRule="auto" w:line="240" w:before="0" w:after="0"/>
         <w:jc w:val="center"/>
         <w:rPr>
           <w:rFonts w:eastAsia="Times New Roman" w:cs="Times New Roman"/>
@@ -25,7 +26,8 @@
     </w:p>
     <w:p>
       <w:pPr>
-        <w:spacing w:after="0" w:line="240" w:lineRule="auto"/>
+        <w:pStyle w:val="Normal"/>
+        <w:spacing w:lineRule="auto" w:line="240" w:before="0" w:after="0"/>
         <w:jc w:val="center"/>
         <w:rPr>
           <w:rFonts w:eastAsia="Times New Roman" w:cs="Times New Roman"/>
@@ -34,23 +36,34 @@
           <w:szCs w:val="26"/>
         </w:rPr>
       </w:pPr>
-    </w:p>
-    <w:p>
-      <w:pPr>
+      <w:r>
+        <w:rPr>
+          <w:rFonts w:eastAsia="Times New Roman" w:cs="Times New Roman"/>
+          <w:b/>
+          <w:bCs/>
+          <w:szCs w:val="26"/>
+        </w:rPr>
+      </w:r>
+    </w:p>
+    <w:p>
+      <w:pPr>
+        <w:pStyle w:val="Normal"/>
         <w:numPr>
           <w:ilvl w:val="0"/>
           <w:numId w:val="1"/>
         </w:numPr>
-        <w:spacing w:before="60" w:after="60" w:line="276" w:lineRule="auto"/>
-        <w:contextualSpacing/>
-        <w:rPr>
-          <w:rFonts w:eastAsia="Times New Roman" w:cs="Times New Roman"/>
-          <w:szCs w:val="26"/>
-        </w:rPr>
-      </w:pPr>
-      <w:r>
-        <w:rPr>
-          <w:rFonts w:eastAsia="Times New Roman" w:cs="Times New Roman"/>
+        <w:spacing w:lineRule="auto" w:line="276" w:before="60" w:after="60"/>
+        <w:contextualSpacing/>
+        <w:rPr>
+          <w:b/>
+          <w:bCs/>
+        </w:rPr>
+      </w:pPr>
+      <w:r>
+        <w:rPr>
+          <w:rFonts w:eastAsia="Times New Roman" w:cs="Times New Roman"/>
+          <w:b/>
+          <w:bCs/>
           <w:szCs w:val="26"/>
         </w:rPr>
         <w:t xml:space="preserve">Một bệnh nhân đang sử dụng chế phẩm bổ sung Biotin với liều 10 mg/ngày được chỉ định lấy máu định lượng CA 72-4. Để đảm bảo kết quả xét nghiệm không bị sai lệch do ảnh hưởng của Biotin, nhân viên y tế cần thực hiện quy trình lấy máu như thế nào là ĐÚNG QUY ĐỊNH? </w:t>
@@ -58,7 +71,8 @@
     </w:p>
     <w:p>
       <w:pPr>
-        <w:spacing w:before="60" w:after="60" w:line="276" w:lineRule="auto"/>
+        <w:pStyle w:val="Normal"/>
+        <w:spacing w:lineRule="auto" w:line="276" w:before="60" w:after="60"/>
         <w:contextualSpacing/>
         <w:rPr>
           <w:rFonts w:eastAsia="Times New Roman" w:cs="Times New Roman"/>
@@ -75,20 +89,18 @@
     </w:p>
     <w:p>
       <w:pPr>
-        <w:spacing w:before="60" w:after="60" w:line="276" w:lineRule="auto"/>
-        <w:contextualSpacing/>
-        <w:rPr>
-          <w:rFonts w:eastAsia="Times New Roman" w:cs="Times New Roman"/>
-          <w:bCs/>
-          <w:color w:val="0000FF"/>
-          <w:szCs w:val="26"/>
-        </w:rPr>
-      </w:pPr>
-      <w:r>
-        <w:rPr>
-          <w:rFonts w:eastAsia="Times New Roman" w:cs="Times New Roman"/>
-          <w:bCs/>
-          <w:color w:val="0000FF"/>
+        <w:pStyle w:val="Normal"/>
+        <w:spacing w:lineRule="auto" w:line="276" w:before="60" w:after="60"/>
+        <w:contextualSpacing/>
+        <w:rPr>
+          <w:color w:val="FF0000"/>
+        </w:rPr>
+      </w:pPr>
+      <w:r>
+        <w:rPr>
+          <w:rFonts w:eastAsia="Times New Roman" w:cs="Times New Roman"/>
+          <w:bCs/>
+          <w:color w:val="FF0000"/>
           <w:szCs w:val="26"/>
         </w:rPr>
         <w:t xml:space="preserve">B. Hướng dẫn bệnh nhân tạm ngừng Biotin và thực hiện lấy máu xét nghiệm ít nhất 8 giờ sau khi dùng Biotin lần cuối. </w:t>
@@ -96,7 +108,8 @@
     </w:p>
     <w:p>
       <w:pPr>
-        <w:spacing w:before="60" w:after="60" w:line="276" w:lineRule="auto"/>
+        <w:pStyle w:val="Normal"/>
+        <w:spacing w:lineRule="auto" w:line="276" w:before="60" w:after="60"/>
         <w:contextualSpacing/>
         <w:rPr>
           <w:rFonts w:eastAsia="Times New Roman" w:cs="Times New Roman"/>
@@ -113,7 +126,8 @@
     </w:p>
     <w:p>
       <w:pPr>
-        <w:spacing w:before="60" w:after="60" w:line="276" w:lineRule="auto"/>
+        <w:pStyle w:val="Normal"/>
+        <w:spacing w:lineRule="auto" w:line="276" w:before="60" w:after="60"/>
         <w:contextualSpacing/>
         <w:rPr>
           <w:rFonts w:eastAsia="Times New Roman" w:cs="Times New Roman"/>
@@ -130,20 +144,23 @@
     </w:p>
     <w:p>
       <w:pPr>
+        <w:pStyle w:val="Normal"/>
         <w:numPr>
           <w:ilvl w:val="0"/>
           <w:numId w:val="1"/>
         </w:numPr>
-        <w:spacing w:before="60" w:after="60" w:line="276" w:lineRule="auto"/>
-        <w:contextualSpacing/>
-        <w:rPr>
-          <w:rFonts w:eastAsia="Times New Roman" w:cs="Times New Roman"/>
-          <w:szCs w:val="26"/>
-        </w:rPr>
-      </w:pPr>
-      <w:r>
-        <w:rPr>
-          <w:rFonts w:eastAsia="Times New Roman" w:cs="Times New Roman"/>
+        <w:spacing w:lineRule="auto" w:line="276" w:before="60" w:after="60"/>
+        <w:contextualSpacing/>
+        <w:rPr>
+          <w:b/>
+          <w:bCs/>
+        </w:rPr>
+      </w:pPr>
+      <w:r>
+        <w:rPr>
+          <w:rFonts w:eastAsia="Times New Roman" w:cs="Times New Roman"/>
+          <w:b/>
+          <w:bCs/>
           <w:szCs w:val="26"/>
         </w:rPr>
         <w:t xml:space="preserve">Một mẫu huyết thanh làm xét nghiệm CA 72-4 đã được bảo quản đông sâu ở -20°C trong 2 tháng. Kỹ thuật viên chuẩn bị phân tích lại mẫu này. Thao tác xử lý bệnh phẩm nào sau đây tuân thủ ĐÚNG quy trình kỹ thuật? </w:t>
@@ -151,7 +168,8 @@
     </w:p>
     <w:p>
       <w:pPr>
-        <w:spacing w:before="60" w:after="60" w:line="276" w:lineRule="auto"/>
+        <w:pStyle w:val="Normal"/>
+        <w:spacing w:lineRule="auto" w:line="276" w:before="60" w:after="60"/>
         <w:contextualSpacing/>
         <w:rPr>
           <w:rFonts w:eastAsia="Times New Roman" w:cs="Times New Roman"/>
@@ -168,20 +186,18 @@
     </w:p>
     <w:p>
       <w:pPr>
-        <w:spacing w:before="60" w:after="60" w:line="276" w:lineRule="auto"/>
-        <w:contextualSpacing/>
-        <w:rPr>
-          <w:rFonts w:eastAsia="Times New Roman" w:cs="Times New Roman"/>
-          <w:bCs/>
-          <w:color w:val="0000FF"/>
-          <w:szCs w:val="26"/>
-        </w:rPr>
-      </w:pPr>
-      <w:r>
-        <w:rPr>
-          <w:rFonts w:eastAsia="Times New Roman" w:cs="Times New Roman"/>
-          <w:bCs/>
-          <w:color w:val="0000FF"/>
+        <w:pStyle w:val="Normal"/>
+        <w:spacing w:lineRule="auto" w:line="276" w:before="60" w:after="60"/>
+        <w:contextualSpacing/>
+        <w:rPr>
+          <w:color w:val="FF0000"/>
+        </w:rPr>
+      </w:pPr>
+      <w:r>
+        <w:rPr>
+          <w:rFonts w:eastAsia="Times New Roman" w:cs="Times New Roman"/>
+          <w:bCs/>
+          <w:color w:val="FF0000"/>
           <w:szCs w:val="26"/>
         </w:rPr>
         <w:t xml:space="preserve">B. Để bệnh phẩm đạt nhiệt độ phòng, đảm bảo mẫu mới chỉ rã đông 1 lần và phân tích trong vòng 2 giờ. </w:t>
@@ -189,7 +205,8 @@
     </w:p>
     <w:p>
       <w:pPr>
-        <w:spacing w:before="60" w:after="60" w:line="276" w:lineRule="auto"/>
+        <w:pStyle w:val="Normal"/>
+        <w:spacing w:lineRule="auto" w:line="276" w:before="60" w:after="60"/>
         <w:contextualSpacing/>
         <w:rPr>
           <w:rFonts w:eastAsia="Times New Roman" w:cs="Times New Roman"/>
@@ -206,7 +223,8 @@
     </w:p>
     <w:p>
       <w:pPr>
-        <w:spacing w:before="60" w:after="60" w:line="276" w:lineRule="auto"/>
+        <w:pStyle w:val="Normal"/>
+        <w:spacing w:lineRule="auto" w:line="276" w:before="60" w:after="60"/>
         <w:contextualSpacing/>
         <w:rPr>
           <w:rFonts w:eastAsia="Times New Roman" w:cs="Times New Roman"/>
@@ -223,20 +241,23 @@
     </w:p>
     <w:p>
       <w:pPr>
+        <w:pStyle w:val="Normal"/>
         <w:numPr>
           <w:ilvl w:val="0"/>
           <w:numId w:val="1"/>
         </w:numPr>
-        <w:spacing w:before="60" w:after="60" w:line="276" w:lineRule="auto"/>
-        <w:contextualSpacing/>
-        <w:rPr>
-          <w:rFonts w:eastAsia="Times New Roman" w:cs="Times New Roman"/>
-          <w:szCs w:val="26"/>
-        </w:rPr>
-      </w:pPr>
-      <w:r>
-        <w:rPr>
-          <w:rFonts w:eastAsia="Times New Roman" w:cs="Times New Roman"/>
+        <w:spacing w:lineRule="auto" w:line="276" w:before="60" w:after="60"/>
+        <w:contextualSpacing/>
+        <w:rPr>
+          <w:b/>
+          <w:bCs/>
+        </w:rPr>
+      </w:pPr>
+      <w:r>
+        <w:rPr>
+          <w:rFonts w:eastAsia="Times New Roman" w:cs="Times New Roman"/>
+          <w:b/>
+          <w:bCs/>
           <w:szCs w:val="26"/>
         </w:rPr>
         <w:t xml:space="preserve">Kỹ thuật viên hóa sinh chuẩn bị dụng cụ lấy 3 ml máu tĩnh mạch để định lượng CA 72-4 cho người bệnh. Loại ống chứa mẫu nào sau đây KHÔNG PHÙ HỢP theo quy định của quy trình? </w:t>
@@ -244,7 +265,8 @@
     </w:p>
     <w:p>
       <w:pPr>
-        <w:spacing w:before="60" w:after="60" w:line="276" w:lineRule="auto"/>
+        <w:pStyle w:val="Normal"/>
+        <w:spacing w:lineRule="auto" w:line="276" w:before="60" w:after="60"/>
         <w:contextualSpacing/>
         <w:rPr>
           <w:rFonts w:eastAsia="Times New Roman" w:cs="Times New Roman"/>
@@ -261,7 +283,8 @@
     </w:p>
     <w:p>
       <w:pPr>
-        <w:spacing w:before="60" w:after="60" w:line="276" w:lineRule="auto"/>
+        <w:pStyle w:val="Normal"/>
+        <w:spacing w:lineRule="auto" w:line="276" w:before="60" w:after="60"/>
         <w:contextualSpacing/>
         <w:rPr>
           <w:rFonts w:eastAsia="Times New Roman" w:cs="Times New Roman"/>
@@ -278,7 +301,8 @@
     </w:p>
     <w:p>
       <w:pPr>
-        <w:spacing w:before="60" w:after="60" w:line="276" w:lineRule="auto"/>
+        <w:pStyle w:val="Normal"/>
+        <w:spacing w:lineRule="auto" w:line="276" w:before="60" w:after="60"/>
         <w:contextualSpacing/>
         <w:rPr>
           <w:rFonts w:eastAsia="Times New Roman" w:cs="Times New Roman"/>
@@ -295,20 +319,18 @@
     </w:p>
     <w:p>
       <w:pPr>
-        <w:spacing w:before="60" w:after="60" w:line="276" w:lineRule="auto"/>
-        <w:contextualSpacing/>
-        <w:rPr>
-          <w:rFonts w:eastAsia="Times New Roman" w:cs="Times New Roman"/>
-          <w:bCs/>
-          <w:color w:val="0000FF"/>
-          <w:szCs w:val="26"/>
-        </w:rPr>
-      </w:pPr>
-      <w:r>
-        <w:rPr>
-          <w:rFonts w:eastAsia="Times New Roman" w:cs="Times New Roman"/>
-          <w:bCs/>
-          <w:color w:val="0000FF"/>
+        <w:pStyle w:val="Normal"/>
+        <w:spacing w:lineRule="auto" w:line="276" w:before="60" w:after="60"/>
+        <w:contextualSpacing/>
+        <w:rPr>
+          <w:color w:val="FF0000"/>
+        </w:rPr>
+      </w:pPr>
+      <w:r>
+        <w:rPr>
+          <w:rFonts w:eastAsia="Times New Roman" w:cs="Times New Roman"/>
+          <w:bCs/>
+          <w:color w:val="FF0000"/>
           <w:szCs w:val="26"/>
         </w:rPr>
         <w:t>D. Ống chứa chất chống đông Sodium-Citrate.</w:t>
@@ -316,20 +338,23 @@
     </w:p>
     <w:p>
       <w:pPr>
+        <w:pStyle w:val="Normal"/>
         <w:numPr>
           <w:ilvl w:val="0"/>
           <w:numId w:val="1"/>
         </w:numPr>
-        <w:spacing w:before="60" w:after="60" w:line="276" w:lineRule="auto"/>
-        <w:contextualSpacing/>
-        <w:rPr>
-          <w:rFonts w:eastAsia="Times New Roman" w:cs="Times New Roman"/>
-          <w:szCs w:val="26"/>
-        </w:rPr>
-      </w:pPr>
-      <w:r>
-        <w:rPr>
-          <w:rFonts w:eastAsia="Times New Roman" w:cs="Times New Roman"/>
+        <w:spacing w:lineRule="auto" w:line="276" w:before="60" w:after="60"/>
+        <w:contextualSpacing/>
+        <w:rPr>
+          <w:b/>
+          <w:bCs/>
+        </w:rPr>
+      </w:pPr>
+      <w:r>
+        <w:rPr>
+          <w:rFonts w:eastAsia="Times New Roman" w:cs="Times New Roman"/>
+          <w:b/>
+          <w:bCs/>
           <w:szCs w:val="26"/>
         </w:rPr>
         <w:t xml:space="preserve">Về nguyên lý định lượng CA 72-4 bằng phương pháp miễn dịch kẹp chả (sandwich) sử dụng công nghệ điện hóa phát quang (ECLIA), phát biểu nào sau đây phản ánh ĐÚNG bản chất của phản ứng? </w:t>
@@ -337,25 +362,35 @@
     </w:p>
     <w:p>
       <w:pPr>
-        <w:spacing w:before="60" w:after="60" w:line="276" w:lineRule="auto"/>
-        <w:contextualSpacing/>
-        <w:rPr>
-          <w:rFonts w:eastAsia="Times New Roman" w:cs="Times New Roman"/>
-          <w:szCs w:val="26"/>
-        </w:rPr>
-      </w:pPr>
-      <w:r>
-        <w:rPr>
-          <w:rFonts w:eastAsia="Times New Roman" w:cs="Times New Roman"/>
-          <w:szCs w:val="26"/>
-        </w:rPr>
-        <w:t xml:space="preserve">A. </w:t>
-      </w:r>
-      <w:r>
-        <w:rPr>
-          <w:rFonts w:eastAsia="Times New Roman" w:cs="Times New Roman"/>
-          <w:bCs/>
-          <w:color w:val="0000FF"/>
+        <w:pStyle w:val="Normal"/>
+        <w:spacing w:lineRule="auto" w:line="276" w:before="60" w:after="60"/>
+        <w:contextualSpacing/>
+        <w:rPr>
+          <w:rFonts w:eastAsia="Times New Roman" w:cs="Times New Roman"/>
+          <w:szCs w:val="26"/>
+        </w:rPr>
+      </w:pPr>
+      <w:r>
+        <w:rPr>
+          <w:rFonts w:eastAsia="Times New Roman" w:cs="Times New Roman"/>
+          <w:color w:val="FF0000"/>
+          <w:szCs w:val="26"/>
+        </w:rPr>
+        <w:t>A</w:t>
+      </w:r>
+      <w:r>
+        <w:rPr>
+          <w:rFonts w:eastAsia="Times New Roman" w:cs="Times New Roman"/>
+          <w:color w:val="FF0000"/>
+          <w:szCs w:val="26"/>
+        </w:rPr>
+        <w:t xml:space="preserve">. </w:t>
+      </w:r>
+      <w:r>
+        <w:rPr>
+          <w:rFonts w:eastAsia="Times New Roman" w:cs="Times New Roman"/>
+          <w:bCs/>
+          <w:color w:val="FF0000"/>
           <w:szCs w:val="26"/>
         </w:rPr>
         <w:t>CA 72-4 đóng vai trò kháng nguyên, bị kẹp giữa kháng thể đơn dòng đặc hiệu kháng CA 72-4 đánh dấu biotin và kháng thể đơn dòng đặc hiệu kháng CA 72-4 đánh dấu ruthenium.</w:t>
@@ -363,6 +398,7 @@
       <w:r>
         <w:rPr>
           <w:rFonts w:eastAsia="Times New Roman" w:cs="Times New Roman"/>
+          <w:color w:val="FF0000"/>
           <w:szCs w:val="26"/>
         </w:rPr>
         <w:t xml:space="preserve"> </w:t>
@@ -370,7 +406,8 @@
     </w:p>
     <w:p>
       <w:pPr>
-        <w:spacing w:before="60" w:after="60" w:line="276" w:lineRule="auto"/>
+        <w:pStyle w:val="Normal"/>
+        <w:spacing w:lineRule="auto" w:line="276" w:before="60" w:after="60"/>
         <w:contextualSpacing/>
         <w:rPr>
           <w:rFonts w:eastAsia="Times New Roman" w:cs="Times New Roman"/>
@@ -387,7 +424,8 @@
     </w:p>
     <w:p>
       <w:pPr>
-        <w:spacing w:before="60" w:after="60" w:line="276" w:lineRule="auto"/>
+        <w:pStyle w:val="Normal"/>
+        <w:spacing w:lineRule="auto" w:line="276" w:before="60" w:after="60"/>
         <w:contextualSpacing/>
         <w:rPr>
           <w:rFonts w:eastAsia="Times New Roman" w:cs="Times New Roman"/>
@@ -404,38 +442,41 @@
     </w:p>
     <w:p>
       <w:pPr>
-        <w:spacing w:before="60" w:after="60" w:line="276" w:lineRule="auto"/>
-        <w:contextualSpacing/>
-        <w:rPr>
-          <w:rFonts w:eastAsia="Times New Roman" w:cs="Times New Roman"/>
-          <w:szCs w:val="26"/>
-        </w:rPr>
-      </w:pPr>
-      <w:r>
-        <w:rPr>
-          <w:rFonts w:eastAsia="Times New Roman" w:cs="Times New Roman"/>
-          <w:szCs w:val="26"/>
-        </w:rPr>
-        <w:lastRenderedPageBreak/>
+        <w:pStyle w:val="Normal"/>
+        <w:spacing w:lineRule="auto" w:line="276" w:before="60" w:after="60"/>
+        <w:contextualSpacing/>
+        <w:rPr>
+          <w:rFonts w:eastAsia="Times New Roman" w:cs="Times New Roman"/>
+          <w:szCs w:val="26"/>
+        </w:rPr>
+      </w:pPr>
+      <w:r>
+        <w:rPr>
+          <w:rFonts w:eastAsia="Times New Roman" w:cs="Times New Roman"/>
+          <w:szCs w:val="26"/>
+        </w:rPr>
         <w:t>D. Cường độ phát quang thu được từ phức hợp miễn dịch tỷ lệ nghịch với nồng độ CA 72-4 có trong mẫu thử do hiện tượng dập tắt huỳnh quang.</w:t>
       </w:r>
     </w:p>
     <w:p>
       <w:pPr>
+        <w:pStyle w:val="Normal"/>
         <w:numPr>
           <w:ilvl w:val="0"/>
           <w:numId w:val="1"/>
         </w:numPr>
-        <w:spacing w:before="60" w:after="60" w:line="276" w:lineRule="auto"/>
-        <w:contextualSpacing/>
-        <w:rPr>
-          <w:rFonts w:eastAsia="Times New Roman" w:cs="Times New Roman"/>
-          <w:szCs w:val="26"/>
-        </w:rPr>
-      </w:pPr>
-      <w:r>
-        <w:rPr>
-          <w:rFonts w:eastAsia="Times New Roman" w:cs="Times New Roman"/>
+        <w:spacing w:lineRule="auto" w:line="276" w:before="60" w:after="60"/>
+        <w:contextualSpacing/>
+        <w:rPr>
+          <w:b/>
+          <w:bCs/>
+        </w:rPr>
+      </w:pPr>
+      <w:r>
+        <w:rPr>
+          <w:rFonts w:eastAsia="Times New Roman" w:cs="Times New Roman"/>
+          <w:b/>
+          <w:bCs/>
           <w:szCs w:val="26"/>
         </w:rPr>
         <w:t xml:space="preserve">Trước khi vận hành phân tích mẫu bệnh phẩm định lượng CA 72-4 trên hệ thống máy tự động (như Cobas e411, e170, e601), điều kiện nào về kiểm tra chất lượng (QC) và thiết bị bắt buộc phải đáp ứng? </w:t>
@@ -443,18 +484,17 @@
     </w:p>
     <w:p>
       <w:pPr>
-        <w:spacing w:before="60" w:after="60" w:line="276" w:lineRule="auto"/>
-        <w:contextualSpacing/>
-        <w:rPr>
-          <w:rFonts w:eastAsia="Times New Roman" w:cs="Times New Roman"/>
-          <w:bCs/>
-          <w:color w:val="0000FF"/>
-          <w:szCs w:val="26"/>
-        </w:rPr>
-      </w:pPr>
-      <w:r>
-        <w:rPr>
-          <w:rFonts w:eastAsia="Times New Roman" w:cs="Times New Roman"/>
+        <w:pStyle w:val="Normal"/>
+        <w:spacing w:lineRule="auto" w:line="276" w:before="60" w:after="60"/>
+        <w:contextualSpacing/>
+        <w:rPr>
+          <w:color w:val="FF0000"/>
+        </w:rPr>
+      </w:pPr>
+      <w:r>
+        <w:rPr>
+          <w:rFonts w:eastAsia="Times New Roman" w:cs="Times New Roman"/>
+          <w:color w:val="FF0000"/>
           <w:szCs w:val="26"/>
         </w:rPr>
         <w:t>A</w:t>
@@ -463,7 +503,7 @@
         <w:rPr>
           <w:rFonts w:eastAsia="Times New Roman" w:cs="Times New Roman"/>
           <w:bCs/>
-          <w:color w:val="0000FF"/>
+          <w:color w:val="FF0000"/>
           <w:szCs w:val="26"/>
         </w:rPr>
         <w:t xml:space="preserve">. Máy đã cài đặt chương trình xét nghiệm CA 72-4, đã được chuẩn với xét nghiệm CA 72-4, kết quả QC đạt yêu cầu không nằm ngoài dải cho phép và không vi phạm luật QC. </w:t>
@@ -471,7 +511,8 @@
     </w:p>
     <w:p>
       <w:pPr>
-        <w:spacing w:before="60" w:after="60" w:line="276" w:lineRule="auto"/>
+        <w:pStyle w:val="Normal"/>
+        <w:spacing w:lineRule="auto" w:line="276" w:before="60" w:after="60"/>
         <w:contextualSpacing/>
         <w:rPr>
           <w:rFonts w:eastAsia="Times New Roman" w:cs="Times New Roman"/>
@@ -490,7 +531,8 @@
     </w:p>
     <w:p>
       <w:pPr>
-        <w:spacing w:before="60" w:after="60" w:line="276" w:lineRule="auto"/>
+        <w:pStyle w:val="Normal"/>
+        <w:spacing w:lineRule="auto" w:line="276" w:before="60" w:after="60"/>
         <w:contextualSpacing/>
         <w:rPr>
           <w:rFonts w:eastAsia="Times New Roman" w:cs="Times New Roman"/>
@@ -507,7 +549,8 @@
     </w:p>
     <w:p>
       <w:pPr>
-        <w:spacing w:before="60" w:after="60" w:line="276" w:lineRule="auto"/>
+        <w:pStyle w:val="Normal"/>
+        <w:spacing w:lineRule="auto" w:line="276" w:before="60" w:after="60"/>
         <w:contextualSpacing/>
         <w:rPr>
           <w:rFonts w:eastAsia="Times New Roman" w:cs="Times New Roman"/>
@@ -524,20 +567,23 @@
     </w:p>
     <w:p>
       <w:pPr>
+        <w:pStyle w:val="Normal"/>
         <w:numPr>
           <w:ilvl w:val="0"/>
           <w:numId w:val="1"/>
         </w:numPr>
-        <w:spacing w:before="60" w:after="60" w:line="276" w:lineRule="auto"/>
-        <w:contextualSpacing/>
-        <w:rPr>
-          <w:rFonts w:eastAsia="Times New Roman" w:cs="Times New Roman"/>
-          <w:szCs w:val="26"/>
-        </w:rPr>
-      </w:pPr>
-      <w:r>
-        <w:rPr>
-          <w:rFonts w:eastAsia="Times New Roman" w:cs="Times New Roman"/>
+        <w:spacing w:lineRule="auto" w:line="276" w:before="60" w:after="60"/>
+        <w:contextualSpacing/>
+        <w:rPr>
+          <w:b/>
+          <w:bCs/>
+        </w:rPr>
+      </w:pPr>
+      <w:r>
+        <w:rPr>
+          <w:rFonts w:eastAsia="Times New Roman" w:cs="Times New Roman"/>
+          <w:b/>
+          <w:bCs/>
           <w:szCs w:val="26"/>
         </w:rPr>
         <w:t>Kết quả xét nghiệm CA 72-4 của một bệnh nhân là 45.0 U/mL. Khi kiểm tra thông số tình trạng mẫu huyết t</w:t>
@@ -547,6 +593,8 @@
       <w:r>
         <w:rPr>
           <w:rFonts w:eastAsia="Times New Roman" w:cs="Times New Roman"/>
+          <w:b/>
+          <w:bCs/>
           <w:szCs w:val="26"/>
         </w:rPr>
         <w:t xml:space="preserve">hanh, kỹ thuật viên ghi nhận: Bilirubin = 40 mg/dL, Hemoglobin = 1.5 g/dL, Triglyceride = 1000 mg/dL, Yếu tố thấp khớp RF = 800 IU/mL. Kỹ thuật viên nên đánh giá kết quả này như thế nào? </w:t>
@@ -554,7 +602,8 @@
     </w:p>
     <w:p>
       <w:pPr>
-        <w:spacing w:before="60" w:after="60" w:line="276" w:lineRule="auto"/>
+        <w:pStyle w:val="Normal"/>
+        <w:spacing w:lineRule="auto" w:line="276" w:before="60" w:after="60"/>
         <w:contextualSpacing/>
         <w:rPr>
           <w:rFonts w:eastAsia="Times New Roman" w:cs="Times New Roman"/>
@@ -571,20 +620,18 @@
     </w:p>
     <w:p>
       <w:pPr>
-        <w:spacing w:before="60" w:after="60" w:line="276" w:lineRule="auto"/>
-        <w:contextualSpacing/>
-        <w:rPr>
-          <w:rFonts w:eastAsia="Times New Roman" w:cs="Times New Roman"/>
-          <w:bCs/>
-          <w:color w:val="0000FF"/>
-          <w:szCs w:val="26"/>
-        </w:rPr>
-      </w:pPr>
-      <w:r>
-        <w:rPr>
-          <w:rFonts w:eastAsia="Times New Roman" w:cs="Times New Roman"/>
-          <w:bCs/>
-          <w:color w:val="0000FF"/>
+        <w:pStyle w:val="Normal"/>
+        <w:spacing w:lineRule="auto" w:line="276" w:before="60" w:after="60"/>
+        <w:contextualSpacing/>
+        <w:rPr>
+          <w:color w:val="FF0000"/>
+        </w:rPr>
+      </w:pPr>
+      <w:r>
+        <w:rPr>
+          <w:rFonts w:eastAsia="Times New Roman" w:cs="Times New Roman"/>
+          <w:bCs/>
+          <w:color w:val="FF0000"/>
           <w:szCs w:val="26"/>
         </w:rPr>
         <w:t xml:space="preserve">B. Kết quả tin cậy vì các chỉ số gây nhiễu đều nằm trong ngưỡng cho phép (Bilirubin &lt; 66 mg/dL, Hb &lt; 2.2 g/dL, Triglyceride &lt; 1500 mg/dL, RF &lt; 1500 IU/mL). </w:t>
@@ -592,7 +639,8 @@
     </w:p>
     <w:p>
       <w:pPr>
-        <w:spacing w:before="60" w:after="60" w:line="276" w:lineRule="auto"/>
+        <w:pStyle w:val="Normal"/>
+        <w:spacing w:lineRule="auto" w:line="276" w:before="60" w:after="60"/>
         <w:contextualSpacing/>
         <w:rPr>
           <w:rFonts w:eastAsia="Times New Roman" w:cs="Times New Roman"/>
@@ -609,7 +657,8 @@
     </w:p>
     <w:p>
       <w:pPr>
-        <w:spacing w:before="60" w:after="60" w:line="276" w:lineRule="auto"/>
+        <w:pStyle w:val="Normal"/>
+        <w:spacing w:lineRule="auto" w:line="276" w:before="60" w:after="60"/>
         <w:contextualSpacing/>
         <w:rPr>
           <w:rFonts w:eastAsia="Times New Roman" w:cs="Times New Roman"/>
@@ -626,20 +675,23 @@
     </w:p>
     <w:p>
       <w:pPr>
+        <w:pStyle w:val="Normal"/>
         <w:numPr>
           <w:ilvl w:val="0"/>
           <w:numId w:val="1"/>
         </w:numPr>
-        <w:spacing w:before="60" w:after="60" w:line="276" w:lineRule="auto"/>
-        <w:contextualSpacing/>
-        <w:rPr>
-          <w:rFonts w:eastAsia="Times New Roman" w:cs="Times New Roman"/>
-          <w:szCs w:val="26"/>
-        </w:rPr>
-      </w:pPr>
-      <w:r>
-        <w:rPr>
-          <w:rFonts w:eastAsia="Times New Roman" w:cs="Times New Roman"/>
+        <w:spacing w:lineRule="auto" w:line="276" w:before="60" w:after="60"/>
+        <w:contextualSpacing/>
+        <w:rPr>
+          <w:b/>
+          <w:bCs/>
+        </w:rPr>
+      </w:pPr>
+      <w:r>
+        <w:rPr>
+          <w:rFonts w:eastAsia="Times New Roman" w:cs="Times New Roman"/>
+          <w:b/>
+          <w:bCs/>
           <w:szCs w:val="26"/>
         </w:rPr>
         <w:t xml:space="preserve">Khi nồng độ CA 72-4 trong mẫu bệnh phẩm vượt dải đo của máy và kỹ thuật viên lựa chọn chế độ "hòa loãng tự động" (automated dilution) trên máy phân tích, việc ghi nhận kết quả cuối cùng để in báo cáo được thực hiện như thế nào? </w:t>
@@ -647,20 +699,18 @@
     </w:p>
     <w:p>
       <w:pPr>
-        <w:spacing w:before="60" w:after="60" w:line="276" w:lineRule="auto"/>
-        <w:contextualSpacing/>
-        <w:rPr>
-          <w:rFonts w:eastAsia="Times New Roman" w:cs="Times New Roman"/>
-          <w:bCs/>
-          <w:color w:val="0000FF"/>
-          <w:szCs w:val="26"/>
-        </w:rPr>
-      </w:pPr>
-      <w:r>
-        <w:rPr>
-          <w:rFonts w:eastAsia="Times New Roman" w:cs="Times New Roman"/>
-          <w:bCs/>
-          <w:color w:val="0000FF"/>
+        <w:pStyle w:val="Normal"/>
+        <w:spacing w:lineRule="auto" w:line="276" w:before="60" w:after="60"/>
+        <w:contextualSpacing/>
+        <w:rPr>
+          <w:color w:val="FF0000"/>
+        </w:rPr>
+      </w:pPr>
+      <w:r>
+        <w:rPr>
+          <w:rFonts w:eastAsia="Times New Roman" w:cs="Times New Roman"/>
+          <w:bCs/>
+          <w:color w:val="FF0000"/>
           <w:szCs w:val="26"/>
         </w:rPr>
         <w:t xml:space="preserve">A. Lấy trực tiếp kết quả máy đã phân tích và tự động tính toán hiển thị, không nhân thêm với độ hòa loãng. </w:t>
@@ -668,7 +718,8 @@
     </w:p>
     <w:p>
       <w:pPr>
-        <w:spacing w:before="60" w:after="60" w:line="276" w:lineRule="auto"/>
+        <w:pStyle w:val="Normal"/>
+        <w:spacing w:lineRule="auto" w:line="276" w:before="60" w:after="60"/>
         <w:contextualSpacing/>
         <w:rPr>
           <w:rFonts w:eastAsia="Times New Roman" w:cs="Times New Roman"/>
@@ -685,7 +736,8 @@
     </w:p>
     <w:p>
       <w:pPr>
-        <w:spacing w:before="60" w:after="60" w:line="276" w:lineRule="auto"/>
+        <w:pStyle w:val="Normal"/>
+        <w:spacing w:lineRule="auto" w:line="276" w:before="60" w:after="60"/>
         <w:contextualSpacing/>
         <w:rPr>
           <w:rFonts w:eastAsia="Times New Roman" w:cs="Times New Roman"/>
@@ -702,7 +754,8 @@
     </w:p>
     <w:p>
       <w:pPr>
-        <w:spacing w:before="60" w:after="60" w:line="276" w:lineRule="auto"/>
+        <w:pStyle w:val="Normal"/>
+        <w:spacing w:lineRule="auto" w:line="276" w:before="60" w:after="60"/>
         <w:contextualSpacing/>
         <w:rPr>
           <w:rFonts w:eastAsia="Times New Roman" w:cs="Times New Roman"/>
@@ -719,28 +772,39 @@
     </w:p>
     <w:p>
       <w:pPr>
+        <w:pStyle w:val="Normal"/>
         <w:numPr>
           <w:ilvl w:val="0"/>
           <w:numId w:val="1"/>
         </w:numPr>
-        <w:spacing w:before="60" w:after="60" w:line="276" w:lineRule="auto"/>
-        <w:contextualSpacing/>
-        <w:rPr>
-          <w:rFonts w:eastAsia="Times New Roman" w:cs="Times New Roman"/>
-          <w:szCs w:val="26"/>
-        </w:rPr>
-      </w:pPr>
-      <w:r>
-        <w:rPr>
-          <w:rFonts w:eastAsia="Times New Roman" w:cs="Times New Roman"/>
-          <w:szCs w:val="26"/>
-        </w:rPr>
-        <w:t xml:space="preserve">Mẫu bệnh phẩm của một bệnh nhân ung thư dạ dày di căn có nồng độ CA 72-4 rất cao. Theo quy trình kỹ thuật, xét nghiệm CA 72-4 này KHÔNG gặp hiện tượng tăng giả âm tính do nồng độ quá cao (Hiệu ứng "high-dose hook") cho tới ngưỡng nồng độ nào? </w:t>
-      </w:r>
-    </w:p>
-    <w:p>
-      <w:pPr>
-        <w:spacing w:before="60" w:after="60" w:line="276" w:lineRule="auto"/>
+        <w:spacing w:lineRule="auto" w:line="276" w:before="60" w:after="60"/>
+        <w:contextualSpacing/>
+        <w:rPr>
+          <w:rFonts w:eastAsia="Times New Roman" w:cs="Times New Roman"/>
+          <w:szCs w:val="26"/>
+        </w:rPr>
+      </w:pPr>
+      <w:r>
+        <w:rPr>
+          <w:rFonts w:eastAsia="Times New Roman" w:cs="Times New Roman"/>
+          <w:b/>
+          <w:bCs/>
+          <w:szCs w:val="26"/>
+        </w:rPr>
+        <w:t>Mẫu bệnh phẩm của một bệnh nhân ung thư dạ dày di căn có nồng độ CA 72-4 rất cao. Theo quy trình kỹ thuật, xét nghiệm CA 72-4 này KHÔNG gặp hiện tượng tăng giả âm tính do nồng độ quá cao (Hiệu ứng "high-dose hook") cho tới ngưỡng nồng độ nào?</w:t>
+      </w:r>
+      <w:r>
+        <w:rPr>
+          <w:rFonts w:eastAsia="Times New Roman" w:cs="Times New Roman"/>
+          <w:szCs w:val="26"/>
+        </w:rPr>
+        <w:t xml:space="preserve"> </w:t>
+      </w:r>
+    </w:p>
+    <w:p>
+      <w:pPr>
+        <w:pStyle w:val="Normal"/>
+        <w:spacing w:lineRule="auto" w:line="276" w:before="60" w:after="60"/>
         <w:contextualSpacing/>
         <w:rPr>
           <w:rFonts w:eastAsia="Times New Roman" w:cs="Times New Roman"/>
@@ -757,7 +821,8 @@
     </w:p>
     <w:p>
       <w:pPr>
-        <w:spacing w:before="60" w:after="60" w:line="276" w:lineRule="auto"/>
+        <w:pStyle w:val="Normal"/>
+        <w:spacing w:lineRule="auto" w:line="276" w:before="60" w:after="60"/>
         <w:contextualSpacing/>
         <w:rPr>
           <w:rFonts w:eastAsia="Times New Roman" w:cs="Times New Roman"/>
@@ -774,7 +839,8 @@
     </w:p>
     <w:p>
       <w:pPr>
-        <w:spacing w:before="60" w:after="60" w:line="276" w:lineRule="auto"/>
+        <w:pStyle w:val="Normal"/>
+        <w:spacing w:lineRule="auto" w:line="276" w:before="60" w:after="60"/>
         <w:contextualSpacing/>
         <w:rPr>
           <w:rFonts w:eastAsia="Times New Roman" w:cs="Times New Roman"/>
@@ -791,42 +857,42 @@
     </w:p>
     <w:p>
       <w:pPr>
-        <w:spacing w:before="60" w:after="60" w:line="276" w:lineRule="auto"/>
-        <w:contextualSpacing/>
-        <w:rPr>
-          <w:rFonts w:eastAsia="Times New Roman" w:cs="Times New Roman"/>
-          <w:bCs/>
-          <w:color w:val="0000FF"/>
-          <w:szCs w:val="26"/>
-        </w:rPr>
-      </w:pPr>
-      <w:r>
-        <w:rPr>
-          <w:rFonts w:eastAsia="Times New Roman" w:cs="Times New Roman"/>
-          <w:bCs/>
-          <w:color w:val="0000FF"/>
-          <w:szCs w:val="26"/>
-        </w:rPr>
-        <w:lastRenderedPageBreak/>
+        <w:pStyle w:val="Normal"/>
+        <w:spacing w:lineRule="auto" w:line="276" w:before="60" w:after="60"/>
+        <w:contextualSpacing/>
+        <w:rPr>
+          <w:color w:val="FF0000"/>
+        </w:rPr>
+      </w:pPr>
+      <w:r>
+        <w:rPr>
+          <w:rFonts w:eastAsia="Times New Roman" w:cs="Times New Roman"/>
+          <w:bCs/>
+          <w:color w:val="FF0000"/>
+          <w:szCs w:val="26"/>
+        </w:rPr>
         <w:t>D. 15 000 U/mL.</w:t>
       </w:r>
     </w:p>
     <w:p>
       <w:pPr>
+        <w:pStyle w:val="Normal"/>
         <w:numPr>
           <w:ilvl w:val="0"/>
           <w:numId w:val="1"/>
         </w:numPr>
-        <w:spacing w:before="60" w:after="60" w:line="276" w:lineRule="auto"/>
-        <w:contextualSpacing/>
-        <w:rPr>
-          <w:rFonts w:eastAsia="Times New Roman" w:cs="Times New Roman"/>
-          <w:szCs w:val="26"/>
-        </w:rPr>
-      </w:pPr>
-      <w:r>
-        <w:rPr>
-          <w:rFonts w:eastAsia="Times New Roman" w:cs="Times New Roman"/>
+        <w:spacing w:lineRule="auto" w:line="276" w:before="60" w:after="60"/>
+        <w:contextualSpacing/>
+        <w:rPr>
+          <w:b/>
+          <w:bCs/>
+        </w:rPr>
+      </w:pPr>
+      <w:r>
+        <w:rPr>
+          <w:rFonts w:eastAsia="Times New Roman" w:cs="Times New Roman"/>
+          <w:b/>
+          <w:bCs/>
           <w:szCs w:val="26"/>
         </w:rPr>
         <w:t xml:space="preserve">Trong lâm sàng, xét nghiệm CA 72-4 có giá trị trong chẩn đoán và theo dõi điều trị ung thư. Việc phối hợp CA 72-4 với dấu ấn sinh học nào sau đây được ghi nhận trong quy trình giúp TĂNG GIÁ TRỊ khi chẩn đoán ung thư dạ dày? </w:t>
@@ -834,20 +900,18 @@
     </w:p>
     <w:p>
       <w:pPr>
-        <w:spacing w:before="60" w:after="60" w:line="276" w:lineRule="auto"/>
-        <w:contextualSpacing/>
-        <w:rPr>
-          <w:rFonts w:eastAsia="Times New Roman" w:cs="Times New Roman"/>
-          <w:bCs/>
-          <w:color w:val="0000FF"/>
-          <w:szCs w:val="26"/>
-        </w:rPr>
-      </w:pPr>
-      <w:r>
-        <w:rPr>
-          <w:rFonts w:eastAsia="Times New Roman" w:cs="Times New Roman"/>
-          <w:bCs/>
-          <w:color w:val="0000FF"/>
+        <w:pStyle w:val="Normal"/>
+        <w:spacing w:lineRule="auto" w:line="276" w:before="60" w:after="60"/>
+        <w:contextualSpacing/>
+        <w:rPr>
+          <w:color w:val="FF0000"/>
+        </w:rPr>
+      </w:pPr>
+      <w:r>
+        <w:rPr>
+          <w:rFonts w:eastAsia="Times New Roman" w:cs="Times New Roman"/>
+          <w:bCs/>
+          <w:color w:val="FF0000"/>
           <w:szCs w:val="26"/>
         </w:rPr>
         <w:t xml:space="preserve">A. CEA. </w:t>
@@ -855,7 +919,8 @@
     </w:p>
     <w:p>
       <w:pPr>
-        <w:spacing w:before="60" w:after="60" w:line="276" w:lineRule="auto"/>
+        <w:pStyle w:val="Normal"/>
+        <w:spacing w:lineRule="auto" w:line="276" w:before="60" w:after="60"/>
         <w:contextualSpacing/>
         <w:rPr>
           <w:rFonts w:eastAsia="Times New Roman" w:cs="Times New Roman"/>
@@ -872,7 +937,8 @@
     </w:p>
     <w:p>
       <w:pPr>
-        <w:spacing w:before="60" w:after="60" w:line="276" w:lineRule="auto"/>
+        <w:pStyle w:val="Normal"/>
+        <w:spacing w:lineRule="auto" w:line="276" w:before="60" w:after="60"/>
         <w:contextualSpacing/>
         <w:rPr>
           <w:rFonts w:eastAsia="Times New Roman" w:cs="Times New Roman"/>
@@ -889,7 +955,8 @@
     </w:p>
     <w:p>
       <w:pPr>
-        <w:spacing w:before="60" w:after="60" w:line="276" w:lineRule="auto"/>
+        <w:pStyle w:val="Normal"/>
+        <w:spacing w:lineRule="auto" w:line="276" w:before="60" w:after="60"/>
         <w:contextualSpacing/>
         <w:rPr>
           <w:rFonts w:eastAsia="Times New Roman" w:cs="Times New Roman"/>
@@ -906,20 +973,23 @@
     </w:p>
     <w:p>
       <w:pPr>
+        <w:pStyle w:val="Normal"/>
         <w:numPr>
           <w:ilvl w:val="0"/>
           <w:numId w:val="1"/>
         </w:numPr>
-        <w:spacing w:before="60" w:after="60" w:line="276" w:lineRule="auto"/>
-        <w:contextualSpacing/>
-        <w:rPr>
-          <w:rFonts w:eastAsia="Times New Roman" w:cs="Times New Roman"/>
-          <w:szCs w:val="26"/>
-        </w:rPr>
-      </w:pPr>
-      <w:r>
-        <w:rPr>
-          <w:rFonts w:eastAsia="Times New Roman" w:cs="Times New Roman"/>
+        <w:spacing w:lineRule="auto" w:line="276" w:before="60" w:after="60"/>
+        <w:contextualSpacing/>
+        <w:rPr>
+          <w:b/>
+          <w:bCs/>
+        </w:rPr>
+      </w:pPr>
+      <w:r>
+        <w:rPr>
+          <w:rFonts w:eastAsia="Times New Roman" w:cs="Times New Roman"/>
+          <w:b/>
+          <w:bCs/>
           <w:szCs w:val="26"/>
         </w:rPr>
         <w:t xml:space="preserve">Khi phân công nhân sự thực hiện quy trình và đánh giá trị số tham chiếu bình thường của xét nghiệm CA 72-4 theo đúng văn bản quy định, sự kết hợp nào sau đây giữa "Người thực hiện" và "Trị số bình thường" là CHÍNH XÁC? </w:t>
@@ -927,20 +997,18 @@
     </w:p>
     <w:p>
       <w:pPr>
-        <w:spacing w:before="60" w:after="60" w:line="276" w:lineRule="auto"/>
-        <w:contextualSpacing/>
-        <w:rPr>
-          <w:rFonts w:eastAsia="Times New Roman" w:cs="Times New Roman"/>
-          <w:bCs/>
-          <w:color w:val="0000FF"/>
-          <w:szCs w:val="26"/>
-        </w:rPr>
-      </w:pPr>
-      <w:r>
-        <w:rPr>
-          <w:rFonts w:eastAsia="Times New Roman" w:cs="Times New Roman"/>
-          <w:bCs/>
-          <w:color w:val="0000FF"/>
+        <w:pStyle w:val="Normal"/>
+        <w:spacing w:lineRule="auto" w:line="276" w:before="60" w:after="60"/>
+        <w:contextualSpacing/>
+        <w:rPr>
+          <w:color w:val="FF0000"/>
+        </w:rPr>
+      </w:pPr>
+      <w:r>
+        <w:rPr>
+          <w:rFonts w:eastAsia="Times New Roman" w:cs="Times New Roman"/>
+          <w:bCs/>
+          <w:color w:val="FF0000"/>
           <w:szCs w:val="26"/>
         </w:rPr>
         <w:t xml:space="preserve">A. Người thực hiện gồm 01 cán bộ đại học, 01 kỹ thuật viên chuyên ngành hóa sinh; Trị số bình thường &lt; 6.9 U/mL. </w:t>
@@ -948,7 +1016,8 @@
     </w:p>
     <w:p>
       <w:pPr>
-        <w:spacing w:before="60" w:after="60" w:line="276" w:lineRule="auto"/>
+        <w:pStyle w:val="Normal"/>
+        <w:spacing w:lineRule="auto" w:line="276" w:before="60" w:after="60"/>
         <w:contextualSpacing/>
         <w:rPr>
           <w:rFonts w:eastAsia="Times New Roman" w:cs="Times New Roman"/>
@@ -965,7 +1034,8 @@
     </w:p>
     <w:p>
       <w:pPr>
-        <w:spacing w:before="60" w:after="60" w:line="276" w:lineRule="auto"/>
+        <w:pStyle w:val="Normal"/>
+        <w:spacing w:lineRule="auto" w:line="276" w:before="60" w:after="60"/>
         <w:contextualSpacing/>
         <w:rPr>
           <w:rFonts w:eastAsia="Times New Roman" w:cs="Times New Roman"/>
@@ -982,7 +1052,8 @@
     </w:p>
     <w:p>
       <w:pPr>
-        <w:spacing w:before="60" w:after="60" w:line="276" w:lineRule="auto"/>
+        <w:pStyle w:val="Normal"/>
+        <w:spacing w:lineRule="auto" w:line="276" w:before="60" w:after="60"/>
         <w:contextualSpacing/>
         <w:rPr>
           <w:rFonts w:eastAsia="Times New Roman" w:cs="Times New Roman"/>
@@ -999,41 +1070,52 @@
     </w:p>
     <w:p>
       <w:pPr>
+        <w:pStyle w:val="Normal"/>
+        <w:spacing w:before="0" w:after="120"/>
         <w:rPr>
           <w:rFonts w:cs="Times New Roman"/>
           <w:szCs w:val="26"/>
         </w:rPr>
       </w:pPr>
+      <w:r>
+        <w:rPr>
+          <w:rFonts w:cs="Times New Roman"/>
+          <w:szCs w:val="26"/>
+        </w:rPr>
+      </w:r>
     </w:p>
     <w:sectPr>
-      <w:pgSz w:w="11907" w:h="16840" w:code="9"/>
-      <w:pgMar w:top="1134" w:right="1134" w:bottom="1134" w:left="1701" w:header="720" w:footer="720" w:gutter="0"/>
-      <w:cols w:space="720"/>
-      <w:docGrid w:linePitch="360"/>
+      <w:type w:val="nextPage"/>
+      <w:pgSz w:w="11906" w:h="16838"/>
+      <w:pgMar w:left="1701" w:right="1134" w:gutter="0" w:header="0" w:top="1134" w:footer="0" w:bottom="1134"/>
+      <w:pgNumType w:fmt="decimal"/>
+      <w:formProt w:val="false"/>
+      <w:textDirection w:val="lrTb"/>
+      <w:docGrid w:type="default" w:linePitch="360" w:charSpace="0"/>
     </w:sectPr>
   </w:body>
 </w:document>
 </file>
 
 <file path=word/numbering.xml><?xml version="1.0" encoding="utf-8"?>
-<w:numbering xmlns:wpc="http://schemas.microsoft.com/office/word/2010/wordprocessingCanvas" xmlns:cx="http://schemas.microsoft.com/office/drawing/2014/chartex" xmlns:mc="http://schemas.openxmlformats.org/markup-compatibility/2006" xmlns:o="urn:schemas-microsoft-com:office:office" xmlns:r="http://schemas.openxmlformats.org/officeDocument/2006/relationships" xmlns:m="http://schemas.openxmlformats.org/officeDocument/2006/math" xmlns:v="urn:schemas-microsoft-com:vml" xmlns:wp14="http://schemas.microsoft.com/office/word/2010/wordprocessingDrawing" xmlns:wp="http://schemas.openxmlformats.org/drawingml/2006/wordprocessingDrawing" xmlns:w10="urn:schemas-microsoft-com:office:word" xmlns:w="http://schemas.openxmlformats.org/wordprocessingml/2006/main" xmlns:w14="http://schemas.microsoft.com/office/word/2010/wordml" xmlns:w15="http://schemas.microsoft.com/office/word/2012/wordml" xmlns:w16se="http://schemas.microsoft.com/office/word/2015/wordml/symex" xmlns:wpg="http://schemas.microsoft.com/office/word/2010/wordprocessingGroup" xmlns:wpi="http://schemas.microsoft.com/office/word/2010/wordprocessingInk" xmlns:wne="http://schemas.microsoft.com/office/word/2006/wordml" xmlns:wps="http://schemas.microsoft.com/office/word/2010/wordprocessingShape" mc:Ignorable="w14 w15 w16se wp14">
-  <w:abstractNum w:abstractNumId="0" w15:restartNumberingAfterBreak="0">
-    <w:nsid w:val="25607D77"/>
-    <w:multiLevelType w:val="multilevel"/>
-    <w:tmpl w:val="25607D77"/>
+<w:numbering xmlns:w="http://schemas.openxmlformats.org/wordprocessingml/2006/main" xmlns:o="urn:schemas-microsoft-com:office:office" xmlns:r="http://schemas.openxmlformats.org/officeDocument/2006/relationships" xmlns:v="urn:schemas-microsoft-com:vml" xmlns:mc="http://schemas.openxmlformats.org/markup-compatibility/2006" xmlns:w14="http://schemas.microsoft.com/office/word/2010/wordml" mc:Ignorable="w14">
+  <w:abstractNum w:abstractNumId="1">
     <w:lvl w:ilvl="0">
       <w:start w:val="1"/>
       <w:numFmt w:val="decimal"/>
       <w:suff w:val="space"/>
       <w:lvlText w:val="Câu %1:"/>
-      <w:lvlJc w:val="left"/>
-      <w:pPr>
-        <w:ind w:left="0" w:firstLine="0"/>
+      <w:lvlJc w:val="start"/>
+      <w:pPr>
+        <w:tabs>
+          <w:tab w:val="num" w:pos="0"/>
+        </w:tabs>
+        <w:ind w:start="0" w:hanging="0"/>
       </w:pPr>
       <w:rPr>
-        <w:rFonts w:ascii="Times New Roman" w:hAnsi="Times New Roman" w:hint="default"/>
+        <w:rFonts w:ascii="Times New Roman" w:hAnsi="Times New Roman"/>
         <w:b/>
-        <w:i w:val="0"/>
+        <w:i w:val="false"/>
         <w:color w:val="auto"/>
         <w:sz w:val="26"/>
         <w:u w:val="single"/>
@@ -1044,14 +1126,16 @@
       <w:numFmt w:val="upperLetter"/>
       <w:suff w:val="space"/>
       <w:lvlText w:val="%2."/>
-      <w:lvlJc w:val="left"/>
-      <w:pPr>
-        <w:ind w:left="563" w:firstLine="97"/>
+      <w:lvlJc w:val="start"/>
+      <w:pPr>
+        <w:tabs>
+          <w:tab w:val="num" w:pos="0"/>
+        </w:tabs>
+        <w:ind w:start="563" w:firstLine="97"/>
       </w:pPr>
       <w:rPr>
-        <w:rFonts w:hint="default"/>
-        <w:b w:val="0"/>
-        <w:bCs w:val="0"/>
+        <w:b w:val="false"/>
+        <w:bCs w:val="false"/>
         <w:color w:val="auto"/>
       </w:rPr>
     </w:lvl>
@@ -1059,99 +1143,228 @@
       <w:start w:val="1"/>
       <w:numFmt w:val="lowerRoman"/>
       <w:lvlText w:val="%3)"/>
-      <w:lvlJc w:val="left"/>
-      <w:pPr>
-        <w:ind w:left="1080" w:hanging="360"/>
-      </w:pPr>
-      <w:rPr>
-        <w:rFonts w:hint="default"/>
-      </w:rPr>
+      <w:lvlJc w:val="start"/>
+      <w:pPr>
+        <w:tabs>
+          <w:tab w:val="num" w:pos="0"/>
+        </w:tabs>
+        <w:ind w:start="1080" w:hanging="360"/>
+      </w:pPr>
+      <w:rPr/>
     </w:lvl>
     <w:lvl w:ilvl="3">
       <w:start w:val="1"/>
       <w:numFmt w:val="decimal"/>
       <w:lvlText w:val="(%4)"/>
-      <w:lvlJc w:val="left"/>
-      <w:pPr>
-        <w:ind w:left="1440" w:hanging="360"/>
-      </w:pPr>
-      <w:rPr>
-        <w:rFonts w:hint="default"/>
-      </w:rPr>
+      <w:lvlJc w:val="start"/>
+      <w:pPr>
+        <w:tabs>
+          <w:tab w:val="num" w:pos="0"/>
+        </w:tabs>
+        <w:ind w:start="1440" w:hanging="360"/>
+      </w:pPr>
+      <w:rPr/>
     </w:lvl>
     <w:lvl w:ilvl="4">
       <w:start w:val="1"/>
       <w:numFmt w:val="lowerLetter"/>
       <w:lvlText w:val="(%5)"/>
-      <w:lvlJc w:val="left"/>
-      <w:pPr>
-        <w:ind w:left="1800" w:hanging="360"/>
-      </w:pPr>
-      <w:rPr>
-        <w:rFonts w:hint="default"/>
-      </w:rPr>
+      <w:lvlJc w:val="start"/>
+      <w:pPr>
+        <w:tabs>
+          <w:tab w:val="num" w:pos="0"/>
+        </w:tabs>
+        <w:ind w:start="1800" w:hanging="360"/>
+      </w:pPr>
+      <w:rPr/>
     </w:lvl>
     <w:lvl w:ilvl="5">
       <w:start w:val="1"/>
       <w:numFmt w:val="lowerRoman"/>
       <w:lvlText w:val="(%6)"/>
-      <w:lvlJc w:val="left"/>
-      <w:pPr>
-        <w:ind w:left="2160" w:hanging="360"/>
-      </w:pPr>
-      <w:rPr>
-        <w:rFonts w:hint="default"/>
-      </w:rPr>
+      <w:lvlJc w:val="start"/>
+      <w:pPr>
+        <w:tabs>
+          <w:tab w:val="num" w:pos="0"/>
+        </w:tabs>
+        <w:ind w:start="2160" w:hanging="360"/>
+      </w:pPr>
+      <w:rPr/>
     </w:lvl>
     <w:lvl w:ilvl="6">
       <w:start w:val="1"/>
       <w:numFmt w:val="decimal"/>
       <w:lvlText w:val="%7."/>
-      <w:lvlJc w:val="left"/>
-      <w:pPr>
-        <w:ind w:left="2520" w:hanging="360"/>
-      </w:pPr>
-      <w:rPr>
-        <w:rFonts w:hint="default"/>
-      </w:rPr>
+      <w:lvlJc w:val="start"/>
+      <w:pPr>
+        <w:tabs>
+          <w:tab w:val="num" w:pos="0"/>
+        </w:tabs>
+        <w:ind w:start="2520" w:hanging="360"/>
+      </w:pPr>
+      <w:rPr/>
     </w:lvl>
     <w:lvl w:ilvl="7">
       <w:start w:val="1"/>
       <w:numFmt w:val="lowerLetter"/>
       <w:lvlText w:val="%8."/>
-      <w:lvlJc w:val="left"/>
-      <w:pPr>
-        <w:ind w:left="2880" w:hanging="360"/>
-      </w:pPr>
-      <w:rPr>
-        <w:rFonts w:hint="default"/>
-      </w:rPr>
+      <w:lvlJc w:val="start"/>
+      <w:pPr>
+        <w:tabs>
+          <w:tab w:val="num" w:pos="0"/>
+        </w:tabs>
+        <w:ind w:start="2880" w:hanging="360"/>
+      </w:pPr>
+      <w:rPr/>
     </w:lvl>
     <w:lvl w:ilvl="8">
       <w:start w:val="1"/>
       <w:numFmt w:val="lowerRoman"/>
       <w:lvlText w:val="%9."/>
-      <w:lvlJc w:val="left"/>
-      <w:pPr>
-        <w:ind w:left="3240" w:hanging="360"/>
-      </w:pPr>
-      <w:rPr>
-        <w:rFonts w:hint="default"/>
-      </w:rPr>
+      <w:lvlJc w:val="start"/>
+      <w:pPr>
+        <w:tabs>
+          <w:tab w:val="num" w:pos="0"/>
+        </w:tabs>
+        <w:ind w:start="3240" w:hanging="360"/>
+      </w:pPr>
+      <w:rPr/>
+    </w:lvl>
+  </w:abstractNum>
+  <w:abstractNum w:abstractNumId="2">
+    <w:lvl w:ilvl="0">
+      <w:start w:val="1"/>
+      <w:numFmt w:val="none"/>
+      <w:suff w:val="nothing"/>
+      <w:lvlText w:val=""/>
+      <w:lvlJc w:val="start"/>
+      <w:pPr>
+        <w:tabs>
+          <w:tab w:val="num" w:pos="0"/>
+        </w:tabs>
+        <w:ind w:start="0" w:hanging="0"/>
+      </w:pPr>
+    </w:lvl>
+    <w:lvl w:ilvl="1">
+      <w:start w:val="1"/>
+      <w:numFmt w:val="none"/>
+      <w:suff w:val="nothing"/>
+      <w:lvlText w:val=""/>
+      <w:lvlJc w:val="start"/>
+      <w:pPr>
+        <w:tabs>
+          <w:tab w:val="num" w:pos="0"/>
+        </w:tabs>
+        <w:ind w:start="0" w:hanging="0"/>
+      </w:pPr>
+    </w:lvl>
+    <w:lvl w:ilvl="2">
+      <w:start w:val="1"/>
+      <w:numFmt w:val="none"/>
+      <w:suff w:val="nothing"/>
+      <w:lvlText w:val=""/>
+      <w:lvlJc w:val="start"/>
+      <w:pPr>
+        <w:tabs>
+          <w:tab w:val="num" w:pos="0"/>
+        </w:tabs>
+        <w:ind w:start="0" w:hanging="0"/>
+      </w:pPr>
+    </w:lvl>
+    <w:lvl w:ilvl="3">
+      <w:start w:val="1"/>
+      <w:numFmt w:val="none"/>
+      <w:suff w:val="nothing"/>
+      <w:lvlText w:val=""/>
+      <w:lvlJc w:val="start"/>
+      <w:pPr>
+        <w:tabs>
+          <w:tab w:val="num" w:pos="0"/>
+        </w:tabs>
+        <w:ind w:start="0" w:hanging="0"/>
+      </w:pPr>
+    </w:lvl>
+    <w:lvl w:ilvl="4">
+      <w:start w:val="1"/>
+      <w:numFmt w:val="none"/>
+      <w:suff w:val="nothing"/>
+      <w:lvlText w:val=""/>
+      <w:lvlJc w:val="start"/>
+      <w:pPr>
+        <w:tabs>
+          <w:tab w:val="num" w:pos="0"/>
+        </w:tabs>
+        <w:ind w:start="0" w:hanging="0"/>
+      </w:pPr>
+    </w:lvl>
+    <w:lvl w:ilvl="5">
+      <w:start w:val="1"/>
+      <w:numFmt w:val="none"/>
+      <w:suff w:val="nothing"/>
+      <w:lvlText w:val=""/>
+      <w:lvlJc w:val="start"/>
+      <w:pPr>
+        <w:tabs>
+          <w:tab w:val="num" w:pos="0"/>
+        </w:tabs>
+        <w:ind w:start="0" w:hanging="0"/>
+      </w:pPr>
+    </w:lvl>
+    <w:lvl w:ilvl="6">
+      <w:start w:val="1"/>
+      <w:numFmt w:val="none"/>
+      <w:suff w:val="nothing"/>
+      <w:lvlText w:val=""/>
+      <w:lvlJc w:val="start"/>
+      <w:pPr>
+        <w:tabs>
+          <w:tab w:val="num" w:pos="0"/>
+        </w:tabs>
+        <w:ind w:start="0" w:hanging="0"/>
+      </w:pPr>
+    </w:lvl>
+    <w:lvl w:ilvl="7">
+      <w:start w:val="1"/>
+      <w:numFmt w:val="none"/>
+      <w:suff w:val="nothing"/>
+      <w:lvlText w:val=""/>
+      <w:lvlJc w:val="start"/>
+      <w:pPr>
+        <w:tabs>
+          <w:tab w:val="num" w:pos="0"/>
+        </w:tabs>
+        <w:ind w:start="0" w:hanging="0"/>
+      </w:pPr>
+    </w:lvl>
+    <w:lvl w:ilvl="8">
+      <w:start w:val="1"/>
+      <w:numFmt w:val="none"/>
+      <w:suff w:val="nothing"/>
+      <w:lvlText w:val=""/>
+      <w:lvlJc w:val="start"/>
+      <w:pPr>
+        <w:tabs>
+          <w:tab w:val="num" w:pos="0"/>
+        </w:tabs>
+        <w:ind w:start="0" w:hanging="0"/>
+      </w:pPr>
     </w:lvl>
   </w:abstractNum>
   <w:num w:numId="1">
-    <w:abstractNumId w:val="0"/>
+    <w:abstractNumId w:val="1"/>
+  </w:num>
+  <w:num w:numId="2">
+    <w:abstractNumId w:val="2"/>
   </w:num>
 </w:numbering>
 </file>
 
 <file path=word/styles.xml><?xml version="1.0" encoding="utf-8"?>
-<w:styles xmlns:mc="http://schemas.openxmlformats.org/markup-compatibility/2006" xmlns:r="http://schemas.openxmlformats.org/officeDocument/2006/relationships" xmlns:w="http://schemas.openxmlformats.org/wordprocessingml/2006/main" xmlns:w14="http://schemas.microsoft.com/office/word/2010/wordml" xmlns:w15="http://schemas.microsoft.com/office/word/2012/wordml" xmlns:w16se="http://schemas.microsoft.com/office/word/2015/wordml/symex" mc:Ignorable="w14 w15 w16se">
+<w:styles xmlns:w="http://schemas.openxmlformats.org/wordprocessingml/2006/main" xmlns:w14="http://schemas.microsoft.com/office/word/2010/wordml" xmlns:mc="http://schemas.openxmlformats.org/markup-compatibility/2006" mc:Ignorable="w14">
   <w:docDefaults>
     <w:rPrDefault>
       <w:rPr>
-        <w:rFonts w:asciiTheme="minorHAnsi" w:eastAsiaTheme="minorHAnsi" w:hAnsiTheme="minorHAnsi" w:cstheme="minorBidi"/>
+        <w:rFonts w:ascii="Calibri" w:hAnsi="Calibri" w:eastAsia="Calibri" w:cs="" w:asciiTheme="minorHAnsi" w:cstheme="minorBidi" w:eastAsiaTheme="minorHAnsi" w:hAnsiTheme="minorHAnsi"/>
         <w:sz w:val="22"/>
         <w:szCs w:val="22"/>
         <w:lang w:val="en-US" w:eastAsia="en-US" w:bidi="ar-SA"/>
@@ -1159,21 +1372,21 @@
     </w:rPrDefault>
     <w:pPrDefault>
       <w:pPr>
-        <w:spacing w:after="160" w:line="259" w:lineRule="auto"/>
+        <w:suppressAutoHyphens w:val="true"/>
       </w:pPr>
     </w:pPrDefault>
   </w:docDefaults>
   <w:latentStyles w:defLockedState="0" w:defUIPriority="99" w:defSemiHidden="0" w:defUnhideWhenUsed="0" w:defQFormat="0" w:count="371">
     <w:lsdException w:name="Normal" w:uiPriority="0" w:qFormat="1"/>
     <w:lsdException w:name="heading 1" w:uiPriority="9" w:qFormat="1"/>
-    <w:lsdException w:name="heading 2" w:semiHidden="1" w:uiPriority="9" w:unhideWhenUsed="1" w:qFormat="1"/>
-    <w:lsdException w:name="heading 3" w:semiHidden="1" w:uiPriority="9" w:unhideWhenUsed="1" w:qFormat="1"/>
-    <w:lsdException w:name="heading 4" w:semiHidden="1" w:uiPriority="9" w:unhideWhenUsed="1" w:qFormat="1"/>
-    <w:lsdException w:name="heading 5" w:semiHidden="1" w:uiPriority="9" w:unhideWhenUsed="1" w:qFormat="1"/>
-    <w:lsdException w:name="heading 6" w:semiHidden="1" w:uiPriority="9" w:unhideWhenUsed="1" w:qFormat="1"/>
-    <w:lsdException w:name="heading 7" w:semiHidden="1" w:uiPriority="9" w:unhideWhenUsed="1" w:qFormat="1"/>
-    <w:lsdException w:name="heading 8" w:semiHidden="1" w:uiPriority="9" w:unhideWhenUsed="1" w:qFormat="1"/>
-    <w:lsdException w:name="heading 9" w:semiHidden="1" w:uiPriority="9" w:unhideWhenUsed="1" w:qFormat="1"/>
+    <w:lsdException w:name="heading 2" w:uiPriority="9" w:semiHidden="1" w:unhideWhenUsed="1" w:qFormat="1"/>
+    <w:lsdException w:name="heading 3" w:uiPriority="9" w:semiHidden="1" w:unhideWhenUsed="1" w:qFormat="1"/>
+    <w:lsdException w:name="heading 4" w:uiPriority="9" w:semiHidden="1" w:unhideWhenUsed="1" w:qFormat="1"/>
+    <w:lsdException w:name="heading 5" w:uiPriority="9" w:semiHidden="1" w:unhideWhenUsed="1" w:qFormat="1"/>
+    <w:lsdException w:name="heading 6" w:uiPriority="9" w:semiHidden="1" w:unhideWhenUsed="1" w:qFormat="1"/>
+    <w:lsdException w:name="heading 7" w:uiPriority="9" w:semiHidden="1" w:unhideWhenUsed="1" w:qFormat="1"/>
+    <w:lsdException w:name="heading 8" w:uiPriority="9" w:semiHidden="1" w:unhideWhenUsed="1" w:qFormat="1"/>
+    <w:lsdException w:name="heading 9" w:uiPriority="9" w:semiHidden="1" w:unhideWhenUsed="1" w:qFormat="1"/>
     <w:lsdException w:name="index 1" w:semiHidden="1" w:unhideWhenUsed="1"/>
     <w:lsdException w:name="index 2" w:semiHidden="1" w:unhideWhenUsed="1"/>
     <w:lsdException w:name="index 3" w:semiHidden="1" w:unhideWhenUsed="1"/>
@@ -1183,22 +1396,22 @@
     <w:lsdException w:name="index 7" w:semiHidden="1" w:unhideWhenUsed="1"/>
     <w:lsdException w:name="index 8" w:semiHidden="1" w:unhideWhenUsed="1"/>
     <w:lsdException w:name="index 9" w:semiHidden="1" w:unhideWhenUsed="1"/>
-    <w:lsdException w:name="toc 1" w:semiHidden="1" w:uiPriority="39" w:unhideWhenUsed="1"/>
-    <w:lsdException w:name="toc 2" w:semiHidden="1" w:uiPriority="39" w:unhideWhenUsed="1"/>
-    <w:lsdException w:name="toc 3" w:semiHidden="1" w:uiPriority="39" w:unhideWhenUsed="1"/>
-    <w:lsdException w:name="toc 4" w:semiHidden="1" w:uiPriority="39" w:unhideWhenUsed="1"/>
-    <w:lsdException w:name="toc 5" w:semiHidden="1" w:uiPriority="39" w:unhideWhenUsed="1"/>
-    <w:lsdException w:name="toc 6" w:semiHidden="1" w:uiPriority="39" w:unhideWhenUsed="1"/>
-    <w:lsdException w:name="toc 7" w:semiHidden="1" w:uiPriority="39" w:unhideWhenUsed="1"/>
-    <w:lsdException w:name="toc 8" w:semiHidden="1" w:uiPriority="39" w:unhideWhenUsed="1"/>
-    <w:lsdException w:name="toc 9" w:semiHidden="1" w:uiPriority="39" w:unhideWhenUsed="1"/>
+    <w:lsdException w:name="toc 1" w:uiPriority="39" w:semiHidden="1" w:unhideWhenUsed="1"/>
+    <w:lsdException w:name="toc 2" w:uiPriority="39" w:semiHidden="1" w:unhideWhenUsed="1"/>
+    <w:lsdException w:name="toc 3" w:uiPriority="39" w:semiHidden="1" w:unhideWhenUsed="1"/>
+    <w:lsdException w:name="toc 4" w:uiPriority="39" w:semiHidden="1" w:unhideWhenUsed="1"/>
+    <w:lsdException w:name="toc 5" w:uiPriority="39" w:semiHidden="1" w:unhideWhenUsed="1"/>
+    <w:lsdException w:name="toc 6" w:uiPriority="39" w:semiHidden="1" w:unhideWhenUsed="1"/>
+    <w:lsdException w:name="toc 7" w:uiPriority="39" w:semiHidden="1" w:unhideWhenUsed="1"/>
+    <w:lsdException w:name="toc 8" w:uiPriority="39" w:semiHidden="1" w:unhideWhenUsed="1"/>
+    <w:lsdException w:name="toc 9" w:uiPriority="39" w:semiHidden="1" w:unhideWhenUsed="1"/>
     <w:lsdException w:name="Normal Indent" w:semiHidden="1" w:unhideWhenUsed="1"/>
     <w:lsdException w:name="footnote text" w:semiHidden="1" w:unhideWhenUsed="1"/>
     <w:lsdException w:name="annotation text" w:semiHidden="1" w:unhideWhenUsed="1"/>
     <w:lsdException w:name="header" w:semiHidden="1" w:unhideWhenUsed="1"/>
     <w:lsdException w:name="footer" w:semiHidden="1" w:unhideWhenUsed="1"/>
     <w:lsdException w:name="index heading" w:semiHidden="1" w:unhideWhenUsed="1"/>
-    <w:lsdException w:name="caption" w:semiHidden="1" w:uiPriority="35" w:unhideWhenUsed="1" w:qFormat="1"/>
+    <w:lsdException w:name="caption" w:uiPriority="35" w:semiHidden="1" w:unhideWhenUsed="1" w:qFormat="1"/>
     <w:lsdException w:name="table of figures" w:semiHidden="1" w:unhideWhenUsed="1"/>
     <w:lsdException w:name="envelope address" w:semiHidden="1" w:unhideWhenUsed="1"/>
     <w:lsdException w:name="envelope return" w:semiHidden="1" w:unhideWhenUsed="1"/>
@@ -1229,7 +1442,7 @@
     <w:lsdException w:name="Title" w:uiPriority="10" w:qFormat="1"/>
     <w:lsdException w:name="Closing" w:semiHidden="1" w:unhideWhenUsed="1"/>
     <w:lsdException w:name="Signature" w:semiHidden="1" w:unhideWhenUsed="1"/>
-    <w:lsdException w:name="Default Paragraph Font" w:semiHidden="1" w:uiPriority="1" w:unhideWhenUsed="1"/>
+    <w:lsdException w:name="Default Paragraph Font" w:uiPriority="1" w:semiHidden="1" w:unhideWhenUsed="1"/>
     <w:lsdException w:name="Body Text" w:semiHidden="1" w:unhideWhenUsed="1"/>
     <w:lsdException w:name="Body Text Indent" w:semiHidden="1" w:unhideWhenUsed="1"/>
     <w:lsdException w:name="List Continue" w:semiHidden="1" w:unhideWhenUsed="1"/>
@@ -1429,8 +1642,8 @@
     <w:lsdException w:name="Subtle Reference" w:uiPriority="31" w:qFormat="1"/>
     <w:lsdException w:name="Intense Reference" w:uiPriority="32" w:qFormat="1"/>
     <w:lsdException w:name="Book Title" w:uiPriority="33" w:qFormat="1"/>
-    <w:lsdException w:name="Bibliography" w:semiHidden="1" w:uiPriority="37" w:unhideWhenUsed="1"/>
-    <w:lsdException w:name="TOC Heading" w:semiHidden="1" w:uiPriority="39" w:unhideWhenUsed="1" w:qFormat="1"/>
+    <w:lsdException w:name="Bibliography" w:uiPriority="37" w:semiHidden="1" w:unhideWhenUsed="1"/>
+    <w:lsdException w:name="TOC Heading" w:uiPriority="39" w:semiHidden="1" w:unhideWhenUsed="1" w:qFormat="1"/>
     <w:lsdException w:name="Plain Table 1" w:uiPriority="41"/>
     <w:lsdException w:name="Plain Table 2" w:uiPriority="42"/>
     <w:lsdException w:name="Plain Table 3" w:uiPriority="43"/>
@@ -1536,17 +1749,24 @@
     <w:lsdException w:name="List Table 6 Colorful Accent 6" w:uiPriority="51"/>
     <w:lsdException w:name="List Table 7 Colorful Accent 6" w:uiPriority="52"/>
   </w:latentStyles>
-  <w:style w:type="paragraph" w:default="1" w:styleId="Normal">
+  <w:style w:type="paragraph" w:styleId="Normal" w:default="1">
     <w:name w:val="Normal"/>
     <w:qFormat/>
-    <w:rsid w:val="00C12B7E"/>
+    <w:rsid w:val="00c12b7e"/>
     <w:pPr>
-      <w:spacing w:after="120" w:line="324" w:lineRule="auto"/>
+      <w:widowControl/>
+      <w:suppressAutoHyphens w:val="true"/>
+      <w:bidi w:val="0"/>
+      <w:spacing w:lineRule="auto" w:line="324" w:before="0" w:after="120"/>
       <w:jc w:val="both"/>
     </w:pPr>
     <w:rPr>
-      <w:rFonts w:ascii="Times New Roman" w:hAnsi="Times New Roman"/>
+      <w:rFonts w:ascii="Times New Roman" w:hAnsi="Times New Roman" w:eastAsia="Calibri" w:cs="" w:cstheme="minorBidi" w:eastAsiaTheme="minorHAnsi"/>
+      <w:color w:val="auto"/>
+      <w:kern w:val="0"/>
       <w:sz w:val="26"/>
+      <w:szCs w:val="22"/>
+      <w:lang w:val="en-US" w:eastAsia="en-US" w:bidi="ar-SA"/>
     </w:rPr>
   </w:style>
   <w:style w:type="paragraph" w:styleId="Heading1">
@@ -1557,16 +1777,16 @@
     <w:autoRedefine/>
     <w:uiPriority w:val="9"/>
     <w:qFormat/>
-    <w:rsid w:val="00C12B7E"/>
+    <w:rsid w:val="00c12b7e"/>
     <w:pPr>
-      <w:keepNext/>
+      <w:keepNext w:val="true"/>
       <w:keepLines/>
       <w:spacing w:before="240" w:after="0"/>
-      <w:jc w:val="left"/>
+      <w:jc w:val="start"/>
       <w:outlineLvl w:val="0"/>
     </w:pPr>
     <w:rPr>
-      <w:rFonts w:eastAsiaTheme="majorEastAsia" w:cstheme="majorBidi"/>
+      <w:rFonts w:eastAsia="" w:cs="" w:cstheme="majorBidi" w:eastAsiaTheme="majorEastAsia"/>
       <w:b/>
       <w:szCs w:val="32"/>
     </w:rPr>
@@ -1581,16 +1801,16 @@
     <w:semiHidden/>
     <w:unhideWhenUsed/>
     <w:qFormat/>
-    <w:rsid w:val="00C12B7E"/>
+    <w:rsid w:val="00c12b7e"/>
     <w:pPr>
-      <w:keepNext/>
+      <w:keepNext w:val="true"/>
       <w:keepLines/>
       <w:spacing w:before="120" w:after="0"/>
-      <w:jc w:val="left"/>
+      <w:jc w:val="start"/>
       <w:outlineLvl w:val="1"/>
     </w:pPr>
     <w:rPr>
-      <w:rFonts w:eastAsiaTheme="majorEastAsia" w:cstheme="majorBidi"/>
+      <w:rFonts w:eastAsia="" w:cs="" w:cstheme="majorBidi" w:eastAsiaTheme="majorEastAsia"/>
       <w:b/>
       <w:szCs w:val="26"/>
     </w:rPr>
@@ -1604,26 +1824,159 @@
     <w:uiPriority w:val="9"/>
     <w:unhideWhenUsed/>
     <w:qFormat/>
-    <w:rsid w:val="00C12B7E"/>
+    <w:rsid w:val="00c12b7e"/>
     <w:pPr>
-      <w:keepNext/>
+      <w:keepNext w:val="true"/>
       <w:keepLines/>
       <w:spacing w:before="120" w:after="0"/>
-      <w:jc w:val="left"/>
+      <w:jc w:val="start"/>
       <w:outlineLvl w:val="2"/>
     </w:pPr>
     <w:rPr>
-      <w:rFonts w:eastAsiaTheme="majorEastAsia" w:cstheme="majorBidi"/>
+      <w:rFonts w:eastAsia="" w:cs="" w:cstheme="majorBidi" w:eastAsiaTheme="majorEastAsia"/>
       <w:b/>
       <w:i/>
       <w:szCs w:val="24"/>
     </w:rPr>
   </w:style>
-  <w:style w:type="character" w:default="1" w:styleId="DefaultParagraphFont">
+  <w:style w:type="character" w:styleId="DefaultParagraphFont" w:default="1">
     <w:name w:val="Default Paragraph Font"/>
     <w:uiPriority w:val="1"/>
     <w:semiHidden/>
     <w:unhideWhenUsed/>
+    <w:qFormat/>
+    <w:rPr/>
+  </w:style>
+  <w:style w:type="character" w:styleId="Heading1Char" w:customStyle="1">
+    <w:name w:val="Heading 1 Char"/>
+    <w:basedOn w:val="DefaultParagraphFont"/>
+    <w:link w:val="Heading1"/>
+    <w:uiPriority w:val="9"/>
+    <w:qFormat/>
+    <w:rsid w:val="00c12b7e"/>
+    <w:rPr>
+      <w:rFonts w:ascii="Times New Roman" w:hAnsi="Times New Roman" w:eastAsia="" w:cs="" w:cstheme="majorBidi" w:eastAsiaTheme="majorEastAsia"/>
+      <w:b/>
+      <w:sz w:val="26"/>
+      <w:szCs w:val="32"/>
+    </w:rPr>
+  </w:style>
+  <w:style w:type="character" w:styleId="Heading2Char" w:customStyle="1">
+    <w:name w:val="Heading 2 Char"/>
+    <w:basedOn w:val="DefaultParagraphFont"/>
+    <w:link w:val="Heading2"/>
+    <w:uiPriority w:val="9"/>
+    <w:semiHidden/>
+    <w:qFormat/>
+    <w:rsid w:val="00c12b7e"/>
+    <w:rPr>
+      <w:rFonts w:ascii="Times New Roman" w:hAnsi="Times New Roman" w:eastAsia="" w:cs="" w:cstheme="majorBidi" w:eastAsiaTheme="majorEastAsia"/>
+      <w:b/>
+      <w:sz w:val="26"/>
+      <w:szCs w:val="26"/>
+    </w:rPr>
+  </w:style>
+  <w:style w:type="character" w:styleId="Heading3Char" w:customStyle="1">
+    <w:name w:val="Heading 3 Char"/>
+    <w:basedOn w:val="DefaultParagraphFont"/>
+    <w:link w:val="Heading3"/>
+    <w:uiPriority w:val="9"/>
+    <w:qFormat/>
+    <w:rsid w:val="00c12b7e"/>
+    <w:rPr>
+      <w:rFonts w:ascii="Times New Roman" w:hAnsi="Times New Roman" w:eastAsia="" w:cs="" w:cstheme="majorBidi" w:eastAsiaTheme="majorEastAsia"/>
+      <w:b/>
+      <w:i/>
+      <w:sz w:val="26"/>
+      <w:szCs w:val="24"/>
+    </w:rPr>
+  </w:style>
+  <w:style w:type="paragraph" w:styleId="Heading">
+    <w:name w:val="Heading"/>
+    <w:basedOn w:val="Normal"/>
+    <w:next w:val="BodyText"/>
+    <w:qFormat/>
+    <w:pPr>
+      <w:keepNext w:val="true"/>
+      <w:spacing w:before="240" w:after="120"/>
+    </w:pPr>
+    <w:rPr>
+      <w:rFonts w:ascii="Liberation Sans" w:hAnsi="Liberation Sans" w:eastAsia="Noto Sans CJK SC" w:cs="Noto Sans Devanagari"/>
+      <w:sz w:val="28"/>
+      <w:szCs w:val="28"/>
+    </w:rPr>
+  </w:style>
+  <w:style w:type="paragraph" w:styleId="BodyText">
+    <w:name w:val="Body Text"/>
+    <w:basedOn w:val="Normal"/>
+    <w:pPr>
+      <w:spacing w:lineRule="auto" w:line="276" w:before="0" w:after="140"/>
+    </w:pPr>
+    <w:rPr/>
+  </w:style>
+  <w:style w:type="paragraph" w:styleId="List">
+    <w:name w:val="List"/>
+    <w:basedOn w:val="BodyText"/>
+    <w:pPr/>
+    <w:rPr>
+      <w:rFonts w:cs="Noto Sans Devanagari"/>
+    </w:rPr>
+  </w:style>
+  <w:style w:type="paragraph" w:styleId="Caption">
+    <w:name w:val="caption"/>
+    <w:basedOn w:val="Normal"/>
+    <w:qFormat/>
+    <w:pPr>
+      <w:suppressLineNumbers/>
+      <w:spacing w:before="120" w:after="120"/>
+    </w:pPr>
+    <w:rPr>
+      <w:rFonts w:cs="Noto Sans Devanagari"/>
+      <w:i/>
+      <w:iCs/>
+      <w:sz w:val="24"/>
+      <w:szCs w:val="24"/>
+    </w:rPr>
+  </w:style>
+  <w:style w:type="paragraph" w:styleId="Index">
+    <w:name w:val="Index"/>
+    <w:basedOn w:val="Normal"/>
+    <w:qFormat/>
+    <w:pPr>
+      <w:suppressLineNumbers/>
+    </w:pPr>
+    <w:rPr>
+      <w:rFonts w:cs="Noto Sans Devanagari"/>
+    </w:rPr>
+  </w:style>
+  <w:style w:type="paragraph" w:styleId="NoSpacing">
+    <w:name w:val="No Spacing"/>
+    <w:autoRedefine/>
+    <w:uiPriority w:val="1"/>
+    <w:qFormat/>
+    <w:rsid w:val="00c12b7e"/>
+    <w:pPr>
+      <w:widowControl/>
+      <w:suppressAutoHyphens w:val="true"/>
+      <w:bidi w:val="0"/>
+      <w:spacing w:lineRule="auto" w:line="240" w:before="0" w:after="0"/>
+      <w:jc w:val="both"/>
+    </w:pPr>
+    <w:rPr>
+      <w:rFonts w:ascii="Times New Roman" w:hAnsi="Times New Roman" w:eastAsia="Calibri" w:cs="" w:cstheme="minorBidi" w:eastAsiaTheme="minorHAnsi"/>
+      <w:color w:val="auto"/>
+      <w:kern w:val="0"/>
+      <w:sz w:val="26"/>
+      <w:szCs w:val="22"/>
+      <w:lang w:val="en-US" w:eastAsia="en-US" w:bidi="ar-SA"/>
+    </w:rPr>
+  </w:style>
+  <w:style w:type="numbering" w:styleId="NoList" w:default="1">
+    <w:name w:val="No List"/>
+    <w:uiPriority w:val="99"/>
+    <w:semiHidden/>
+    <w:unhideWhenUsed/>
+    <w:qFormat/>
   </w:style>
   <w:style w:type="table" w:default="1" w:styleId="TableNormal">
     <w:name w:val="Normal Table"/>
@@ -1631,7 +1984,6 @@
     <w:semiHidden/>
     <w:unhideWhenUsed/>
     <w:tblPr>
-      <w:tblInd w:w="0" w:type="dxa"/>
       <w:tblCellMar>
         <w:top w:w="0" w:type="dxa"/>
         <w:left w:w="108" w:type="dxa"/>
@@ -1640,80 +1992,18 @@
       </w:tblCellMar>
     </w:tblPr>
   </w:style>
-  <w:style w:type="numbering" w:default="1" w:styleId="NoList">
-    <w:name w:val="No List"/>
-    <w:uiPriority w:val="99"/>
-    <w:semiHidden/>
-    <w:unhideWhenUsed/>
-  </w:style>
-  <w:style w:type="paragraph" w:styleId="NoSpacing">
-    <w:name w:val="No Spacing"/>
-    <w:autoRedefine/>
-    <w:uiPriority w:val="1"/>
-    <w:qFormat/>
-    <w:rsid w:val="00C12B7E"/>
-    <w:pPr>
-      <w:spacing w:after="0" w:line="240" w:lineRule="auto"/>
-      <w:jc w:val="both"/>
-    </w:pPr>
-    <w:rPr>
-      <w:rFonts w:ascii="Times New Roman" w:hAnsi="Times New Roman"/>
-      <w:sz w:val="26"/>
-    </w:rPr>
-  </w:style>
-  <w:style w:type="character" w:customStyle="1" w:styleId="Heading1Char">
-    <w:name w:val="Heading 1 Char"/>
-    <w:basedOn w:val="DefaultParagraphFont"/>
-    <w:link w:val="Heading1"/>
-    <w:uiPriority w:val="9"/>
-    <w:rsid w:val="00C12B7E"/>
-    <w:rPr>
-      <w:rFonts w:ascii="Times New Roman" w:eastAsiaTheme="majorEastAsia" w:hAnsi="Times New Roman" w:cstheme="majorBidi"/>
-      <w:b/>
-      <w:sz w:val="26"/>
-      <w:szCs w:val="32"/>
-    </w:rPr>
-  </w:style>
-  <w:style w:type="character" w:customStyle="1" w:styleId="Heading2Char">
-    <w:name w:val="Heading 2 Char"/>
-    <w:basedOn w:val="DefaultParagraphFont"/>
-    <w:link w:val="Heading2"/>
-    <w:uiPriority w:val="9"/>
-    <w:semiHidden/>
-    <w:rsid w:val="00C12B7E"/>
-    <w:rPr>
-      <w:rFonts w:ascii="Times New Roman" w:eastAsiaTheme="majorEastAsia" w:hAnsi="Times New Roman" w:cstheme="majorBidi"/>
-      <w:b/>
-      <w:sz w:val="26"/>
-      <w:szCs w:val="26"/>
-    </w:rPr>
-  </w:style>
-  <w:style w:type="character" w:customStyle="1" w:styleId="Heading3Char">
-    <w:name w:val="Heading 3 Char"/>
-    <w:basedOn w:val="DefaultParagraphFont"/>
-    <w:link w:val="Heading3"/>
-    <w:uiPriority w:val="9"/>
-    <w:rsid w:val="00C12B7E"/>
-    <w:rPr>
-      <w:rFonts w:ascii="Times New Roman" w:eastAsiaTheme="majorEastAsia" w:hAnsi="Times New Roman" w:cstheme="majorBidi"/>
-      <w:b/>
-      <w:i/>
-      <w:sz w:val="26"/>
-      <w:szCs w:val="24"/>
-    </w:rPr>
-  </w:style>
 </w:styles>
 </file>
 
 <file path=word/theme/theme1.xml><?xml version="1.0" encoding="utf-8"?>
-<a:theme xmlns:a="http://schemas.openxmlformats.org/drawingml/2006/main" name="Office Theme">
+<a:theme xmlns:a="http://schemas.openxmlformats.org/drawingml/2006/main" xmlns:r="http://schemas.openxmlformats.org/officeDocument/2006/relationships" name="Office Theme">
   <a:themeElements>
     <a:clrScheme name="Office">
       <a:dk1>
-        <a:sysClr val="windowText" lastClr="000000"/>
+        <a:srgbClr val="000000"/>
       </a:dk1>
       <a:lt1>
-        <a:sysClr val="window" lastClr="FFFFFF"/>
+        <a:srgbClr val="FFFFFF"/>
       </a:lt1>
       <a:dk2>
         <a:srgbClr val="44546A"/>
@@ -1748,119 +2038,55 @@
     </a:clrScheme>
     <a:fontScheme name="Office">
       <a:majorFont>
-        <a:latin typeface="Calibri Light" panose="020F0302020204030204"/>
+        <a:latin typeface="Calibri Light" panose="020F0302020204030204" pitchFamily="0" charset="1"/>
         <a:ea typeface=""/>
         <a:cs typeface=""/>
-        <a:font script="Jpan" typeface="游ゴシック Light"/>
-        <a:font script="Hang" typeface="맑은 고딕"/>
-        <a:font script="Hans" typeface="等线 Light"/>
-        <a:font script="Hant" typeface="新細明體"/>
-        <a:font script="Arab" typeface="Times New Roman"/>
-        <a:font script="Hebr" typeface="Times New Roman"/>
-        <a:font script="Thai" typeface="Angsana New"/>
-        <a:font script="Ethi" typeface="Nyala"/>
-        <a:font script="Beng" typeface="Vrinda"/>
-        <a:font script="Gujr" typeface="Shruti"/>
-        <a:font script="Khmr" typeface="MoolBoran"/>
-        <a:font script="Knda" typeface="Tunga"/>
-        <a:font script="Guru" typeface="Raavi"/>
-        <a:font script="Cans" typeface="Euphemia"/>
-        <a:font script="Cher" typeface="Plantagenet Cherokee"/>
-        <a:font script="Yiii" typeface="Microsoft Yi Baiti"/>
-        <a:font script="Tibt" typeface="Microsoft Himalaya"/>
-        <a:font script="Thaa" typeface="MV Boli"/>
-        <a:font script="Deva" typeface="Mangal"/>
-        <a:font script="Telu" typeface="Gautami"/>
-        <a:font script="Taml" typeface="Latha"/>
-        <a:font script="Syrc" typeface="Estrangelo Edessa"/>
-        <a:font script="Orya" typeface="Kalinga"/>
-        <a:font script="Mlym" typeface="Kartika"/>
-        <a:font script="Laoo" typeface="DokChampa"/>
-        <a:font script="Sinh" typeface="Iskoola Pota"/>
-        <a:font script="Mong" typeface="Mongolian Baiti"/>
-        <a:font script="Viet" typeface="Times New Roman"/>
-        <a:font script="Uigh" typeface="Microsoft Uighur"/>
-        <a:font script="Geor" typeface="Sylfaen"/>
       </a:majorFont>
       <a:minorFont>
-        <a:latin typeface="Calibri" panose="020F0502020204030204"/>
+        <a:latin typeface="Calibri" panose="020F0502020204030204" pitchFamily="0" charset="1"/>
         <a:ea typeface=""/>
         <a:cs typeface=""/>
-        <a:font script="Jpan" typeface="游明朝"/>
-        <a:font script="Hang" typeface="맑은 고딕"/>
-        <a:font script="Hans" typeface="等线"/>
-        <a:font script="Hant" typeface="新細明體"/>
-        <a:font script="Arab" typeface="Arial"/>
-        <a:font script="Hebr" typeface="Arial"/>
-        <a:font script="Thai" typeface="Cordia New"/>
-        <a:font script="Ethi" typeface="Nyala"/>
-        <a:font script="Beng" typeface="Vrinda"/>
-        <a:font script="Gujr" typeface="Shruti"/>
-        <a:font script="Khmr" typeface="DaunPenh"/>
-        <a:font script="Knda" typeface="Tunga"/>
-        <a:font script="Guru" typeface="Raavi"/>
-        <a:font script="Cans" typeface="Euphemia"/>
-        <a:font script="Cher" typeface="Plantagenet Cherokee"/>
-        <a:font script="Yiii" typeface="Microsoft Yi Baiti"/>
-        <a:font script="Tibt" typeface="Microsoft Himalaya"/>
-        <a:font script="Thaa" typeface="MV Boli"/>
-        <a:font script="Deva" typeface="Mangal"/>
-        <a:font script="Telu" typeface="Gautami"/>
-        <a:font script="Taml" typeface="Latha"/>
-        <a:font script="Syrc" typeface="Estrangelo Edessa"/>
-        <a:font script="Orya" typeface="Kalinga"/>
-        <a:font script="Mlym" typeface="Kartika"/>
-        <a:font script="Laoo" typeface="DokChampa"/>
-        <a:font script="Sinh" typeface="Iskoola Pota"/>
-        <a:font script="Mong" typeface="Mongolian Baiti"/>
-        <a:font script="Viet" typeface="Arial"/>
-        <a:font script="Uigh" typeface="Microsoft Uighur"/>
-        <a:font script="Geor" typeface="Sylfaen"/>
       </a:minorFont>
     </a:fontScheme>
-    <a:fmtScheme name="Office">
+    <a:fmtScheme>
       <a:fillStyleLst>
         <a:solidFill>
           <a:schemeClr val="phClr"/>
         </a:solidFill>
-        <a:gradFill rotWithShape="1">
+        <a:gradFill>
           <a:gsLst>
             <a:gs pos="0">
               <a:schemeClr val="phClr">
                 <a:lumMod val="110000"/>
-                <a:satMod val="105000"/>
                 <a:tint val="67000"/>
               </a:schemeClr>
             </a:gs>
             <a:gs pos="50000">
               <a:schemeClr val="phClr">
                 <a:lumMod val="105000"/>
-                <a:satMod val="103000"/>
                 <a:tint val="73000"/>
               </a:schemeClr>
             </a:gs>
             <a:gs pos="100000">
               <a:schemeClr val="phClr">
                 <a:lumMod val="105000"/>
-                <a:satMod val="109000"/>
                 <a:tint val="81000"/>
               </a:schemeClr>
             </a:gs>
           </a:gsLst>
           <a:lin ang="5400000" scaled="0"/>
+          <a:tileRect l="0" t="0" r="0" b="0"/>
         </a:gradFill>
-        <a:gradFill rotWithShape="1">
+        <a:gradFill>
           <a:gsLst>
             <a:gs pos="0">
               <a:schemeClr val="phClr">
-                <a:satMod val="103000"/>
                 <a:lumMod val="102000"/>
                 <a:tint val="94000"/>
               </a:schemeClr>
             </a:gs>
             <a:gs pos="50000">
               <a:schemeClr val="phClr">
-                <a:satMod val="110000"/>
                 <a:lumMod val="100000"/>
                 <a:shade val="100000"/>
               </a:schemeClr>
@@ -1868,33 +2094,24 @@
             <a:gs pos="100000">
               <a:schemeClr val="phClr">
                 <a:lumMod val="99000"/>
-                <a:satMod val="120000"/>
                 <a:shade val="78000"/>
               </a:schemeClr>
             </a:gs>
           </a:gsLst>
           <a:lin ang="5400000" scaled="0"/>
+          <a:tileRect l="0" t="0" r="0" b="0"/>
         </a:gradFill>
       </a:fillStyleLst>
       <a:lnStyleLst>
         <a:ln w="6350" cap="flat" cmpd="sng" algn="ctr">
-          <a:solidFill>
-            <a:schemeClr val="phClr"/>
-          </a:solidFill>
           <a:prstDash val="solid"/>
           <a:miter lim="800000"/>
         </a:ln>
         <a:ln w="12700" cap="flat" cmpd="sng" algn="ctr">
-          <a:solidFill>
-            <a:schemeClr val="phClr"/>
-          </a:solidFill>
           <a:prstDash val="solid"/>
           <a:miter lim="800000"/>
         </a:ln>
         <a:ln w="19050" cap="flat" cmpd="sng" algn="ctr">
-          <a:solidFill>
-            <a:schemeClr val="phClr"/>
-          </a:solidFill>
           <a:prstDash val="solid"/>
           <a:miter lim="800000"/>
         </a:ln>
@@ -1907,13 +2124,7 @@
           <a:effectLst/>
         </a:effectStyle>
         <a:effectStyle>
-          <a:effectLst>
-            <a:outerShdw blurRad="57150" dist="19050" dir="5400000" algn="ctr" rotWithShape="0">
-              <a:srgbClr val="000000">
-                <a:alpha val="63000"/>
-              </a:srgbClr>
-            </a:outerShdw>
-          </a:effectLst>
+          <a:effectLst/>
         </a:effectStyle>
       </a:effectStyleLst>
       <a:bgFillStyleLst>
@@ -1923,15 +2134,13 @@
         <a:solidFill>
           <a:schemeClr val="phClr">
             <a:tint val="95000"/>
-            <a:satMod val="170000"/>
           </a:schemeClr>
         </a:solidFill>
-        <a:gradFill rotWithShape="1">
+        <a:gradFill>
           <a:gsLst>
             <a:gs pos="0">
               <a:schemeClr val="phClr">
                 <a:tint val="93000"/>
-                <a:satMod val="150000"/>
                 <a:shade val="98000"/>
                 <a:lumMod val="102000"/>
               </a:schemeClr>
@@ -1939,7 +2148,6 @@
             <a:gs pos="50000">
               <a:schemeClr val="phClr">
                 <a:tint val="98000"/>
-                <a:satMod val="130000"/>
                 <a:shade val="90000"/>
                 <a:lumMod val="103000"/>
               </a:schemeClr>
@@ -1947,21 +2155,14 @@
             <a:gs pos="100000">
               <a:schemeClr val="phClr">
                 <a:shade val="63000"/>
-                <a:satMod val="120000"/>
               </a:schemeClr>
             </a:gs>
           </a:gsLst>
           <a:lin ang="5400000" scaled="0"/>
+          <a:tileRect l="0" t="0" r="0" b="0"/>
         </a:gradFill>
       </a:bgFillStyleLst>
     </a:fmtScheme>
   </a:themeElements>
-  <a:objectDefaults/>
-  <a:extraClrSchemeLst/>
-  <a:extLst>
-    <a:ext uri="{05A4C25C-085E-4340-85A3-A5531E510DB2}">
-      <thm15:themeFamily xmlns:thm15="http://schemas.microsoft.com/office/thememl/2012/main" name="Office Theme" id="{62F939B6-93AF-4DB8-9C6B-D6C7DFDC589F}" vid="{4A3C46E8-61CC-4603-A589-7422A47A8E4A}"/>
-    </a:ext>
-  </a:extLst>
 </a:theme>
 </file>
</xml_diff>